<commit_message>
8.10.2025 - chapter 1, shotgun data results.
</commit_message>
<xml_diff>
--- a/thesis/discussion.docx
+++ b/thesis/discussion.docx
@@ -4,7 +4,7 @@
   <w:body>
     <w:p>
       <w:pPr>
-        <w:pStyle w:val="Naslov1"/>
+        <w:pStyle w:val="Heading1"/>
         <w:rPr>
           <w:sz w:val="22"/>
         </w:rPr>
@@ -304,21 +304,7 @@
         <w:rPr>
           <w:lang w:val="en-GB"/>
         </w:rPr>
-        <w:t xml:space="preserve"> were not detected. Members of the phylum </w:t>
-      </w:r>
-      <w:proofErr w:type="spellStart"/>
-      <w:r>
-        <w:rPr>
-          <w:lang w:val="en-GB"/>
-        </w:rPr>
-        <w:t>Pseudomonadota</w:t>
-      </w:r>
-      <w:proofErr w:type="spellEnd"/>
-      <w:r>
-        <w:rPr>
-          <w:lang w:val="en-GB"/>
-        </w:rPr>
-        <w:t xml:space="preserve">, also commonly </w:t>
+        <w:t xml:space="preserve"> were not detected. Members of the phylum Pseudomonadota, also commonly </w:t>
       </w:r>
       <w:r>
         <w:rPr>
@@ -775,6 +761,7 @@
         </w:rPr>
         <w:t xml:space="preserve">Density of clustering for everyone is individual dependant, so based on their changes in the life. But still ethanol-resistant especially ethanol-resistant </w:t>
       </w:r>
+      <w:proofErr w:type="gramStart"/>
       <w:r>
         <w:rPr>
           <w:i/>
@@ -787,7 +774,324 @@
         <w:rPr>
           <w:lang w:val="en-GB"/>
         </w:rPr>
-        <w:t xml:space="preserve"> the sporobiota of the gut community is more similar to itself in time than other ethanol-resistant or ethanol non-resistant communities. </w:t>
+        <w:t xml:space="preserve"> the</w:t>
+      </w:r>
+      <w:proofErr w:type="gramEnd"/>
+      <w:r>
+        <w:rPr>
+          <w:lang w:val="en-GB"/>
+        </w:rPr>
+        <w:t xml:space="preserve"> sporobiota of the gut community is more similar to itself in time than other ethanol-resistant or ethanol non-resistant communities. </w:t>
+      </w:r>
+    </w:p>
+    <w:p>
+      <w:pPr>
+        <w:rPr>
+          <w:lang w:val="en-GB"/>
+        </w:rPr>
+      </w:pPr>
+    </w:p>
+    <w:p>
+      <w:pPr>
+        <w:rPr>
+          <w:rFonts w:cs="Times New Roman"/>
+          <w:lang w:val="en-GB"/>
+        </w:rPr>
+      </w:pPr>
+    </w:p>
+    <w:p>
+      <w:pPr>
+        <w:pStyle w:val="ListParagraph"/>
+        <w:numPr>
+          <w:ilvl w:val="2"/>
+          <w:numId w:val="1"/>
+        </w:numPr>
+        <w:spacing w:line="360" w:lineRule="auto"/>
+        <w:jc w:val="both"/>
+        <w:rPr>
+          <w:rFonts w:cs="Times New Roman"/>
+          <w:lang w:val="en-GB"/>
+        </w:rPr>
+      </w:pPr>
+      <w:r>
+        <w:rPr>
+          <w:rFonts w:cs="Times New Roman"/>
+          <w:lang w:val="en-GB"/>
+        </w:rPr>
+        <w:lastRenderedPageBreak/>
+        <w:t xml:space="preserve">Stability </w:t>
+      </w:r>
+    </w:p>
+    <w:p>
+      <w:pPr>
+        <w:rPr>
+          <w:lang w:val="en-GB"/>
+        </w:rPr>
+      </w:pPr>
+      <w:r>
+        <w:rPr>
+          <w:lang w:val="en-GB"/>
+        </w:rPr>
+        <w:t xml:space="preserve">By different definitions of stability this community on the level of OTUs is stable, as the return to previous after disturbance such as antibiotic treatment and travel (individuals A, B, C, D) is either not even visible in the observation of relative abundance or they have return to ‘previous state’ quickly after the disturbance (H). One possible explanation for this could also be the time scale of our sampling, as bacterial generation time is on the scale from hours to a day, while our sampling took place every 14 weeks. So, we were able to observe larger ecological changes that did not occur, as opposed to smaller changes in hour to hour. </w:t>
+      </w:r>
+    </w:p>
+    <w:p>
+      <w:pPr>
+        <w:rPr>
+          <w:lang w:val="en-GB"/>
+        </w:rPr>
+      </w:pPr>
+      <w:r>
+        <w:rPr>
+          <w:lang w:val="en-GB"/>
+        </w:rPr>
+        <w:t>We</w:t>
+      </w:r>
+      <w:r>
+        <w:rPr>
+          <w:lang w:val="en-GB"/>
+        </w:rPr>
+        <w:t xml:space="preserve"> have shown than in the span of 6 months in 9 individuals that we </w:t>
+      </w:r>
+      <w:proofErr w:type="gramStart"/>
+      <w:r>
+        <w:rPr>
+          <w:lang w:val="en-GB"/>
+        </w:rPr>
+        <w:t>samples</w:t>
+      </w:r>
+      <w:proofErr w:type="gramEnd"/>
+      <w:r>
+        <w:rPr>
+          <w:lang w:val="en-GB"/>
+        </w:rPr>
+        <w:t xml:space="preserve"> the OTUs we </w:t>
+      </w:r>
+      <w:proofErr w:type="spellStart"/>
+      <w:r>
+        <w:rPr>
+          <w:lang w:val="en-GB"/>
+        </w:rPr>
+        <w:t>receovered</w:t>
+      </w:r>
+      <w:proofErr w:type="spellEnd"/>
+      <w:r>
+        <w:rPr>
+          <w:lang w:val="en-GB"/>
+        </w:rPr>
+        <w:t xml:space="preserve"> from bulk microbiota either they be part of the ethanol resistant or ethanol non-resistant fraction are stable. There are no alternative stable states or large transitions. Even though two of participants consumed antibiotics during the study (E, H) there is no proof of instability. </w:t>
+      </w:r>
+    </w:p>
+    <w:p>
+      <w:pPr>
+        <w:rPr>
+          <w:lang w:val="en-GB"/>
+        </w:rPr>
+      </w:pPr>
+      <w:r>
+        <w:rPr>
+          <w:noProof/>
+          <w:lang w:val="en-GB"/>
+        </w:rPr>
+        <w:drawing>
+          <wp:inline distT="0" distB="0" distL="0" distR="0" wp14:anchorId="22596975" wp14:editId="5B2F797B">
+            <wp:extent cx="5926455" cy="2924175"/>
+            <wp:effectExtent l="0" t="0" r="0" b="9525"/>
+            <wp:docPr id="488952858" name="Picture 5" descr="Slika, ki vsebuje besede besedilo, posnetek zaslona, barvitost, oblikovanje&#10;&#10;Vsebina, ustvarjena z UI, morda ni pravilna."/>
+            <wp:cNvGraphicFramePr>
+              <a:graphicFrameLocks xmlns:a="http://schemas.openxmlformats.org/drawingml/2006/main" noChangeAspect="1"/>
+            </wp:cNvGraphicFramePr>
+            <a:graphic xmlns:a="http://schemas.openxmlformats.org/drawingml/2006/main">
+              <a:graphicData uri="http://schemas.openxmlformats.org/drawingml/2006/picture">
+                <pic:pic xmlns:pic="http://schemas.openxmlformats.org/drawingml/2006/picture">
+                  <pic:nvPicPr>
+                    <pic:cNvPr id="488952858" name="Picture 5" descr="Slika, ki vsebuje besede besedilo, posnetek zaslona, barvitost, oblikovanje&#10;&#10;Vsebina, ustvarjena z UI, morda ni pravilna."/>
+                    <pic:cNvPicPr>
+                      <a:picLocks noChangeAspect="1" noChangeArrowheads="1"/>
+                    </pic:cNvPicPr>
+                  </pic:nvPicPr>
+                  <pic:blipFill>
+                    <a:blip r:embed="rId5">
+                      <a:extLst>
+                        <a:ext uri="{28A0092B-C50C-407E-A947-70E740481C1C}">
+                          <a14:useLocalDpi xmlns:a14="http://schemas.microsoft.com/office/drawing/2010/main" val="0"/>
+                        </a:ext>
+                      </a:extLst>
+                    </a:blip>
+                    <a:srcRect/>
+                    <a:stretch>
+                      <a:fillRect/>
+                    </a:stretch>
+                  </pic:blipFill>
+                  <pic:spPr bwMode="auto">
+                    <a:xfrm>
+                      <a:off x="0" y="0"/>
+                      <a:ext cx="5926455" cy="2924175"/>
+                    </a:xfrm>
+                    <a:prstGeom prst="rect">
+                      <a:avLst/>
+                    </a:prstGeom>
+                    <a:noFill/>
+                    <a:ln>
+                      <a:noFill/>
+                    </a:ln>
+                  </pic:spPr>
+                </pic:pic>
+              </a:graphicData>
+            </a:graphic>
+          </wp:inline>
+        </w:drawing>
+      </w:r>
+    </w:p>
+    <w:p>
+      <w:pPr>
+        <w:rPr>
+          <w:lang w:val="en-GB"/>
+        </w:rPr>
+      </w:pPr>
+      <w:r>
+        <w:rPr>
+          <w:lang w:val="en-GB"/>
+        </w:rPr>
+        <w:t>Figure</w:t>
+      </w:r>
+      <w:r>
+        <w:rPr>
+          <w:lang w:val="en-GB"/>
+        </w:rPr>
+        <w:t xml:space="preserve"> 11</w:t>
+      </w:r>
+      <w:r>
+        <w:rPr>
+          <w:lang w:val="en-GB"/>
+        </w:rPr>
+        <w:t xml:space="preserve">: Relative abundance of each OTU through time for </w:t>
+      </w:r>
+      <w:proofErr w:type="gramStart"/>
+      <w:r>
+        <w:rPr>
+          <w:lang w:val="en-GB"/>
+        </w:rPr>
+        <w:t>each individual</w:t>
+      </w:r>
+      <w:proofErr w:type="gramEnd"/>
+      <w:r>
+        <w:rPr>
+          <w:lang w:val="en-GB"/>
+        </w:rPr>
+        <w:t xml:space="preserve">. There is no indication for alternative stable states, as even individuals E and H, that consumed AB there is the return to the same as before in relative abundance of all observed OTUs. </w:t>
+      </w:r>
+    </w:p>
+    <w:p>
+      <w:pPr>
+        <w:rPr>
+          <w:lang w:val="en-GB"/>
+        </w:rPr>
+      </w:pPr>
+    </w:p>
+    <w:p>
+      <w:pPr>
+        <w:rPr>
+          <w:lang w:val="en-GB"/>
+        </w:rPr>
+      </w:pPr>
+    </w:p>
+    <w:p>
+      <w:pPr>
+        <w:rPr>
+          <w:rFonts w:cs="Times New Roman"/>
+          <w:u w:val="single"/>
+          <w:lang w:val="en-GB"/>
+        </w:rPr>
+      </w:pPr>
+      <w:r>
+        <w:rPr>
+          <w:rFonts w:cs="Times New Roman"/>
+          <w:u w:val="single"/>
+          <w:lang w:val="en-GB"/>
+        </w:rPr>
+        <w:t>Hypothesis 2: Gut sporobiota and microbiota will change during the extreme event in most volunteers.</w:t>
+      </w:r>
+    </w:p>
+    <w:p>
+      <w:pPr>
+        <w:rPr>
+          <w:rFonts w:cs="Times New Roman"/>
+          <w:lang w:val="en-GB"/>
+        </w:rPr>
+      </w:pPr>
+      <w:r>
+        <w:rPr>
+          <w:rFonts w:cs="Times New Roman"/>
+          <w:lang w:val="en-GB"/>
+        </w:rPr>
+        <w:t xml:space="preserve">Goals: </w:t>
+      </w:r>
+    </w:p>
+    <w:p>
+      <w:pPr>
+        <w:rPr>
+          <w:rFonts w:cs="Times New Roman"/>
+          <w:color w:val="FF0000"/>
+          <w:lang w:val="en-GB"/>
+        </w:rPr>
+      </w:pPr>
+      <w:r>
+        <w:rPr>
+          <w:rFonts w:cs="Times New Roman"/>
+          <w:color w:val="FF0000"/>
+          <w:lang w:val="en-GB"/>
+        </w:rPr>
+        <w:lastRenderedPageBreak/>
+        <w:t>what will be the distance between the points of samples from regular monitoring and samples from extreme events</w:t>
+      </w:r>
+    </w:p>
+    <w:p>
+      <w:pPr>
+        <w:rPr>
+          <w:rFonts w:cs="Times New Roman"/>
+          <w:color w:val="FF0000"/>
+          <w:lang w:val="en-GB"/>
+        </w:rPr>
+      </w:pPr>
+      <w:r>
+        <w:rPr>
+          <w:rFonts w:cs="Times New Roman"/>
+          <w:color w:val="FF0000"/>
+          <w:lang w:val="en-GB"/>
+        </w:rPr>
+        <w:t xml:space="preserve">CHECK for correlations in changes between alpha and travel and alpha and AB consumption! </w:t>
+      </w:r>
+    </w:p>
+    <w:p>
+      <w:pPr>
+        <w:rPr>
+          <w:rFonts w:cs="Times New Roman"/>
+          <w:lang w:val="en-GB"/>
+        </w:rPr>
+      </w:pPr>
+      <w:r>
+        <w:rPr>
+          <w:rFonts w:cs="Times New Roman"/>
+          <w:lang w:val="en-GB"/>
+        </w:rPr>
+        <w:t xml:space="preserve">Although we followed a large </w:t>
+      </w:r>
+      <w:proofErr w:type="gramStart"/>
+      <w:r>
+        <w:rPr>
+          <w:rFonts w:cs="Times New Roman"/>
+          <w:lang w:val="en-GB"/>
+        </w:rPr>
+        <w:t>number</w:t>
+      </w:r>
+      <w:proofErr w:type="gramEnd"/>
+      <w:r>
+        <w:rPr>
+          <w:rFonts w:cs="Times New Roman"/>
+          <w:lang w:val="en-GB"/>
+        </w:rPr>
+        <w:t xml:space="preserve"> of metadata at each time point of sampling, our study is too small (in terms of number of same changes in the whole study) and also changes were to sporadic by individual and between individuals so could not be (with exception of antibiotic consumption) statistically significant linked to changes in the alpha diversity of individuals through time. </w:t>
       </w:r>
     </w:p>
     <w:p>
@@ -805,6 +1109,135 @@
     </w:sectPr>
   </w:body>
 </w:document>
+</file>
+
+<file path=word/numbering.xml><?xml version="1.0" encoding="utf-8"?>
+<w:numbering xmlns:wpc="http://schemas.microsoft.com/office/word/2010/wordprocessingCanvas" xmlns:cx="http://schemas.microsoft.com/office/drawing/2014/chartex" xmlns:cx1="http://schemas.microsoft.com/office/drawing/2015/9/8/chartex" xmlns:cx2="http://schemas.microsoft.com/office/drawing/2015/10/21/chartex" xmlns:cx3="http://schemas.microsoft.com/office/drawing/2016/5/9/chartex" xmlns:cx4="http://schemas.microsoft.com/office/drawing/2016/5/10/chartex" xmlns:cx5="http://schemas.microsoft.com/office/drawing/2016/5/11/chartex" xmlns:cx6="http://schemas.microsoft.com/office/drawing/2016/5/12/chartex" xmlns:cx7="http://schemas.microsoft.com/office/drawing/2016/5/13/chartex" xmlns:cx8="http://schemas.microsoft.com/office/drawing/2016/5/14/chartex" xmlns:mc="http://schemas.openxmlformats.org/markup-compatibility/2006" xmlns:aink="http://schemas.microsoft.com/office/drawing/2016/ink" xmlns:am3d="http://schemas.microsoft.com/office/drawing/2017/model3d" xmlns:o="urn:schemas-microsoft-com:office:office" xmlns:oel="http://schemas.microsoft.com/office/2019/extlst" xmlns:r="http://schemas.openxmlformats.org/officeDocument/2006/relationships" xmlns:m="http://schemas.openxmlformats.org/officeDocument/2006/math" xmlns:v="urn:schemas-microsoft-com:vml" xmlns:wp14="http://schemas.microsoft.com/office/word/2010/wordprocessingDrawing" xmlns:wp="http://schemas.openxmlformats.org/drawingml/2006/wordprocessingDrawing" xmlns:w10="urn:schemas-microsoft-com:office:word" xmlns:w="http://schemas.openxmlformats.org/wordprocessingml/2006/main" xmlns:w14="http://schemas.microsoft.com/office/word/2010/wordml" xmlns:w15="http://schemas.microsoft.com/office/word/2012/wordml" xmlns:w16cex="http://schemas.microsoft.com/office/word/2018/wordml/cex" xmlns:w16cid="http://schemas.microsoft.com/office/word/2016/wordml/cid" xmlns:w16="http://schemas.microsoft.com/office/word/2018/wordml" xmlns:w16du="http://schemas.microsoft.com/office/word/2023/wordml/word16du" xmlns:w16sdtdh="http://schemas.microsoft.com/office/word/2020/wordml/sdtdatahash" xmlns:w16sdtfl="http://schemas.microsoft.com/office/word/2024/wordml/sdtformatlock" xmlns:w16se="http://schemas.microsoft.com/office/word/2015/wordml/symex" xmlns:wpg="http://schemas.microsoft.com/office/word/2010/wordprocessingGroup" xmlns:wpi="http://schemas.microsoft.com/office/word/2010/wordprocessingInk" xmlns:wne="http://schemas.microsoft.com/office/word/2006/wordml" xmlns:wps="http://schemas.microsoft.com/office/word/2010/wordprocessingShape" mc:Ignorable="w14 w15 w16se w16cid w16 w16cex w16sdtdh w16sdtfl w16du wp14">
+  <w:abstractNum w:abstractNumId="0" w15:restartNumberingAfterBreak="0">
+    <w:nsid w:val="76D35432"/>
+    <w:multiLevelType w:val="multilevel"/>
+    <w:tmpl w:val="1ADAA6D8"/>
+    <w:lvl w:ilvl="0">
+      <w:start w:val="1"/>
+      <w:numFmt w:val="decimal"/>
+      <w:lvlText w:val="%1."/>
+      <w:lvlJc w:val="left"/>
+      <w:pPr>
+        <w:ind w:left="720" w:hanging="360"/>
+      </w:pPr>
+      <w:rPr>
+        <w:rFonts w:hint="default"/>
+      </w:rPr>
+    </w:lvl>
+    <w:lvl w:ilvl="1">
+      <w:start w:val="1"/>
+      <w:numFmt w:val="decimal"/>
+      <w:isLgl/>
+      <w:lvlText w:val="%1.%2."/>
+      <w:lvlJc w:val="left"/>
+      <w:pPr>
+        <w:ind w:left="720" w:hanging="360"/>
+      </w:pPr>
+      <w:rPr>
+        <w:rFonts w:hint="default"/>
+      </w:rPr>
+    </w:lvl>
+    <w:lvl w:ilvl="2">
+      <w:start w:val="1"/>
+      <w:numFmt w:val="decimal"/>
+      <w:isLgl/>
+      <w:lvlText w:val="%1.%2.%3."/>
+      <w:lvlJc w:val="left"/>
+      <w:pPr>
+        <w:ind w:left="1080" w:hanging="720"/>
+      </w:pPr>
+      <w:rPr>
+        <w:rFonts w:hint="default"/>
+      </w:rPr>
+    </w:lvl>
+    <w:lvl w:ilvl="3">
+      <w:start w:val="1"/>
+      <w:numFmt w:val="decimal"/>
+      <w:isLgl/>
+      <w:lvlText w:val="%1.%2.%3.%4."/>
+      <w:lvlJc w:val="left"/>
+      <w:pPr>
+        <w:ind w:left="1080" w:hanging="720"/>
+      </w:pPr>
+      <w:rPr>
+        <w:rFonts w:hint="default"/>
+      </w:rPr>
+    </w:lvl>
+    <w:lvl w:ilvl="4">
+      <w:start w:val="1"/>
+      <w:numFmt w:val="decimal"/>
+      <w:isLgl/>
+      <w:lvlText w:val="%1.%2.%3.%4.%5."/>
+      <w:lvlJc w:val="left"/>
+      <w:pPr>
+        <w:ind w:left="1440" w:hanging="1080"/>
+      </w:pPr>
+      <w:rPr>
+        <w:rFonts w:hint="default"/>
+      </w:rPr>
+    </w:lvl>
+    <w:lvl w:ilvl="5">
+      <w:start w:val="1"/>
+      <w:numFmt w:val="decimal"/>
+      <w:isLgl/>
+      <w:lvlText w:val="%1.%2.%3.%4.%5.%6."/>
+      <w:lvlJc w:val="left"/>
+      <w:pPr>
+        <w:ind w:left="1440" w:hanging="1080"/>
+      </w:pPr>
+      <w:rPr>
+        <w:rFonts w:hint="default"/>
+      </w:rPr>
+    </w:lvl>
+    <w:lvl w:ilvl="6">
+      <w:start w:val="1"/>
+      <w:numFmt w:val="decimal"/>
+      <w:isLgl/>
+      <w:lvlText w:val="%1.%2.%3.%4.%5.%6.%7."/>
+      <w:lvlJc w:val="left"/>
+      <w:pPr>
+        <w:ind w:left="1800" w:hanging="1440"/>
+      </w:pPr>
+      <w:rPr>
+        <w:rFonts w:hint="default"/>
+      </w:rPr>
+    </w:lvl>
+    <w:lvl w:ilvl="7">
+      <w:start w:val="1"/>
+      <w:numFmt w:val="decimal"/>
+      <w:isLgl/>
+      <w:lvlText w:val="%1.%2.%3.%4.%5.%6.%7.%8."/>
+      <w:lvlJc w:val="left"/>
+      <w:pPr>
+        <w:ind w:left="1800" w:hanging="1440"/>
+      </w:pPr>
+      <w:rPr>
+        <w:rFonts w:hint="default"/>
+      </w:rPr>
+    </w:lvl>
+    <w:lvl w:ilvl="8">
+      <w:start w:val="1"/>
+      <w:numFmt w:val="decimal"/>
+      <w:isLgl/>
+      <w:lvlText w:val="%1.%2.%3.%4.%5.%6.%7.%8.%9."/>
+      <w:lvlJc w:val="left"/>
+      <w:pPr>
+        <w:ind w:left="2160" w:hanging="1800"/>
+      </w:pPr>
+      <w:rPr>
+        <w:rFonts w:hint="default"/>
+      </w:rPr>
+    </w:lvl>
+  </w:abstractNum>
+  <w:num w:numId="1" w16cid:durableId="2082478144">
+    <w:abstractNumId w:val="0"/>
+  </w:num>
+</w:numbering>
 </file>
 
 <file path=word/styles.xml><?xml version="1.0" encoding="utf-8"?>
@@ -1204,7 +1637,7 @@
     <w:lsdException w:name="Unresolved Mention" w:semiHidden="1" w:unhideWhenUsed="1"/>
     <w:lsdException w:name="Smart Link" w:semiHidden="1" w:unhideWhenUsed="1"/>
   </w:latentStyles>
-  <w:style w:type="paragraph" w:default="1" w:styleId="Navaden">
+  <w:style w:type="paragraph" w:default="1" w:styleId="Normal">
     <w:name w:val="Normal"/>
     <w:qFormat/>
     <w:rsid w:val="00951A8E"/>
@@ -1218,11 +1651,11 @@
       <w14:ligatures w14:val="none"/>
     </w:rPr>
   </w:style>
-  <w:style w:type="paragraph" w:styleId="Naslov1">
+  <w:style w:type="paragraph" w:styleId="Heading1">
     <w:name w:val="heading 1"/>
-    <w:basedOn w:val="Navaden"/>
-    <w:next w:val="Navaden"/>
-    <w:link w:val="Naslov1Znak"/>
+    <w:basedOn w:val="Normal"/>
+    <w:next w:val="Normal"/>
+    <w:link w:val="Heading1Char"/>
     <w:uiPriority w:val="9"/>
     <w:qFormat/>
     <w:rsid w:val="00951A8E"/>
@@ -1242,11 +1675,11 @@
       <w14:ligatures w14:val="standardContextual"/>
     </w:rPr>
   </w:style>
-  <w:style w:type="paragraph" w:styleId="Naslov2">
+  <w:style w:type="paragraph" w:styleId="Heading2">
     <w:name w:val="heading 2"/>
-    <w:basedOn w:val="Navaden"/>
-    <w:next w:val="Navaden"/>
-    <w:link w:val="Naslov2Znak"/>
+    <w:basedOn w:val="Normal"/>
+    <w:next w:val="Normal"/>
+    <w:link w:val="Heading2Char"/>
     <w:uiPriority w:val="9"/>
     <w:semiHidden/>
     <w:unhideWhenUsed/>
@@ -1268,11 +1701,11 @@
       <w14:ligatures w14:val="standardContextual"/>
     </w:rPr>
   </w:style>
-  <w:style w:type="paragraph" w:styleId="Naslov3">
+  <w:style w:type="paragraph" w:styleId="Heading3">
     <w:name w:val="heading 3"/>
-    <w:basedOn w:val="Navaden"/>
-    <w:next w:val="Navaden"/>
-    <w:link w:val="Naslov3Znak"/>
+    <w:basedOn w:val="Normal"/>
+    <w:next w:val="Normal"/>
+    <w:link w:val="Heading3Char"/>
     <w:uiPriority w:val="9"/>
     <w:semiHidden/>
     <w:unhideWhenUsed/>
@@ -1294,11 +1727,11 @@
       <w14:ligatures w14:val="standardContextual"/>
     </w:rPr>
   </w:style>
-  <w:style w:type="paragraph" w:styleId="Naslov4">
+  <w:style w:type="paragraph" w:styleId="Heading4">
     <w:name w:val="heading 4"/>
-    <w:basedOn w:val="Navaden"/>
-    <w:next w:val="Navaden"/>
-    <w:link w:val="Naslov4Znak"/>
+    <w:basedOn w:val="Normal"/>
+    <w:next w:val="Normal"/>
+    <w:link w:val="Heading4Char"/>
     <w:uiPriority w:val="9"/>
     <w:semiHidden/>
     <w:unhideWhenUsed/>
@@ -1320,11 +1753,11 @@
       <w14:ligatures w14:val="standardContextual"/>
     </w:rPr>
   </w:style>
-  <w:style w:type="paragraph" w:styleId="Naslov5">
+  <w:style w:type="paragraph" w:styleId="Heading5">
     <w:name w:val="heading 5"/>
-    <w:basedOn w:val="Navaden"/>
-    <w:next w:val="Navaden"/>
-    <w:link w:val="Naslov5Znak"/>
+    <w:basedOn w:val="Normal"/>
+    <w:next w:val="Normal"/>
+    <w:link w:val="Heading5Char"/>
     <w:uiPriority w:val="9"/>
     <w:semiHidden/>
     <w:unhideWhenUsed/>
@@ -1344,11 +1777,11 @@
       <w14:ligatures w14:val="standardContextual"/>
     </w:rPr>
   </w:style>
-  <w:style w:type="paragraph" w:styleId="Naslov6">
+  <w:style w:type="paragraph" w:styleId="Heading6">
     <w:name w:val="heading 6"/>
-    <w:basedOn w:val="Navaden"/>
-    <w:next w:val="Navaden"/>
-    <w:link w:val="Naslov6Znak"/>
+    <w:basedOn w:val="Normal"/>
+    <w:next w:val="Normal"/>
+    <w:link w:val="Heading6Char"/>
     <w:uiPriority w:val="9"/>
     <w:semiHidden/>
     <w:unhideWhenUsed/>
@@ -1370,11 +1803,11 @@
       <w14:ligatures w14:val="standardContextual"/>
     </w:rPr>
   </w:style>
-  <w:style w:type="paragraph" w:styleId="Naslov7">
+  <w:style w:type="paragraph" w:styleId="Heading7">
     <w:name w:val="heading 7"/>
-    <w:basedOn w:val="Navaden"/>
-    <w:next w:val="Navaden"/>
-    <w:link w:val="Naslov7Znak"/>
+    <w:basedOn w:val="Normal"/>
+    <w:next w:val="Normal"/>
+    <w:link w:val="Heading7Char"/>
     <w:uiPriority w:val="9"/>
     <w:semiHidden/>
     <w:unhideWhenUsed/>
@@ -1394,11 +1827,11 @@
       <w14:ligatures w14:val="standardContextual"/>
     </w:rPr>
   </w:style>
-  <w:style w:type="paragraph" w:styleId="Naslov8">
+  <w:style w:type="paragraph" w:styleId="Heading8">
     <w:name w:val="heading 8"/>
-    <w:basedOn w:val="Navaden"/>
-    <w:next w:val="Navaden"/>
-    <w:link w:val="Naslov8Znak"/>
+    <w:basedOn w:val="Normal"/>
+    <w:next w:val="Normal"/>
+    <w:link w:val="Heading8Char"/>
     <w:uiPriority w:val="9"/>
     <w:semiHidden/>
     <w:unhideWhenUsed/>
@@ -1420,11 +1853,11 @@
       <w14:ligatures w14:val="standardContextual"/>
     </w:rPr>
   </w:style>
-  <w:style w:type="paragraph" w:styleId="Naslov9">
+  <w:style w:type="paragraph" w:styleId="Heading9">
     <w:name w:val="heading 9"/>
-    <w:basedOn w:val="Navaden"/>
-    <w:next w:val="Navaden"/>
-    <w:link w:val="Naslov9Znak"/>
+    <w:basedOn w:val="Normal"/>
+    <w:next w:val="Normal"/>
+    <w:link w:val="Heading9Char"/>
     <w:uiPriority w:val="9"/>
     <w:semiHidden/>
     <w:unhideWhenUsed/>
@@ -1444,13 +1877,13 @@
       <w14:ligatures w14:val="standardContextual"/>
     </w:rPr>
   </w:style>
-  <w:style w:type="character" w:default="1" w:styleId="Privzetapisavaodstavka">
+  <w:style w:type="character" w:default="1" w:styleId="DefaultParagraphFont">
     <w:name w:val="Default Paragraph Font"/>
     <w:uiPriority w:val="1"/>
     <w:semiHidden/>
     <w:unhideWhenUsed/>
   </w:style>
-  <w:style w:type="table" w:default="1" w:styleId="Navadnatabela">
+  <w:style w:type="table" w:default="1" w:styleId="TableNormal">
     <w:name w:val="Normal Table"/>
     <w:uiPriority w:val="99"/>
     <w:semiHidden/>
@@ -1465,16 +1898,16 @@
       </w:tblCellMar>
     </w:tblPr>
   </w:style>
-  <w:style w:type="numbering" w:default="1" w:styleId="Brezseznama">
+  <w:style w:type="numbering" w:default="1" w:styleId="NoList">
     <w:name w:val="No List"/>
     <w:uiPriority w:val="99"/>
     <w:semiHidden/>
     <w:unhideWhenUsed/>
   </w:style>
-  <w:style w:type="character" w:customStyle="1" w:styleId="Naslov1Znak">
-    <w:name w:val="Naslov 1 Znak"/>
-    <w:basedOn w:val="Privzetapisavaodstavka"/>
-    <w:link w:val="Naslov1"/>
+  <w:style w:type="character" w:customStyle="1" w:styleId="Heading1Char">
+    <w:name w:val="Heading 1 Char"/>
+    <w:basedOn w:val="DefaultParagraphFont"/>
+    <w:link w:val="Heading1"/>
     <w:uiPriority w:val="9"/>
     <w:rsid w:val="00951A8E"/>
     <w:rPr>
@@ -1484,10 +1917,10 @@
       <w:szCs w:val="40"/>
     </w:rPr>
   </w:style>
-  <w:style w:type="character" w:customStyle="1" w:styleId="Naslov2Znak">
-    <w:name w:val="Naslov 2 Znak"/>
-    <w:basedOn w:val="Privzetapisavaodstavka"/>
-    <w:link w:val="Naslov2"/>
+  <w:style w:type="character" w:customStyle="1" w:styleId="Heading2Char">
+    <w:name w:val="Heading 2 Char"/>
+    <w:basedOn w:val="DefaultParagraphFont"/>
+    <w:link w:val="Heading2"/>
     <w:uiPriority w:val="9"/>
     <w:semiHidden/>
     <w:rsid w:val="00951A8E"/>
@@ -1498,10 +1931,10 @@
       <w:szCs w:val="32"/>
     </w:rPr>
   </w:style>
-  <w:style w:type="character" w:customStyle="1" w:styleId="Naslov3Znak">
-    <w:name w:val="Naslov 3 Znak"/>
-    <w:basedOn w:val="Privzetapisavaodstavka"/>
-    <w:link w:val="Naslov3"/>
+  <w:style w:type="character" w:customStyle="1" w:styleId="Heading3Char">
+    <w:name w:val="Heading 3 Char"/>
+    <w:basedOn w:val="DefaultParagraphFont"/>
+    <w:link w:val="Heading3"/>
     <w:uiPriority w:val="9"/>
     <w:semiHidden/>
     <w:rsid w:val="00951A8E"/>
@@ -1512,10 +1945,10 @@
       <w:szCs w:val="28"/>
     </w:rPr>
   </w:style>
-  <w:style w:type="character" w:customStyle="1" w:styleId="Naslov4Znak">
-    <w:name w:val="Naslov 4 Znak"/>
-    <w:basedOn w:val="Privzetapisavaodstavka"/>
-    <w:link w:val="Naslov4"/>
+  <w:style w:type="character" w:customStyle="1" w:styleId="Heading4Char">
+    <w:name w:val="Heading 4 Char"/>
+    <w:basedOn w:val="DefaultParagraphFont"/>
+    <w:link w:val="Heading4"/>
     <w:uiPriority w:val="9"/>
     <w:semiHidden/>
     <w:rsid w:val="00951A8E"/>
@@ -1526,10 +1959,10 @@
       <w:color w:val="2F5496" w:themeColor="accent1" w:themeShade="BF"/>
     </w:rPr>
   </w:style>
-  <w:style w:type="character" w:customStyle="1" w:styleId="Naslov5Znak">
-    <w:name w:val="Naslov 5 Znak"/>
-    <w:basedOn w:val="Privzetapisavaodstavka"/>
-    <w:link w:val="Naslov5"/>
+  <w:style w:type="character" w:customStyle="1" w:styleId="Heading5Char">
+    <w:name w:val="Heading 5 Char"/>
+    <w:basedOn w:val="DefaultParagraphFont"/>
+    <w:link w:val="Heading5"/>
     <w:uiPriority w:val="9"/>
     <w:semiHidden/>
     <w:rsid w:val="00951A8E"/>
@@ -1538,10 +1971,10 @@
       <w:color w:val="2F5496" w:themeColor="accent1" w:themeShade="BF"/>
     </w:rPr>
   </w:style>
-  <w:style w:type="character" w:customStyle="1" w:styleId="Naslov6Znak">
-    <w:name w:val="Naslov 6 Znak"/>
-    <w:basedOn w:val="Privzetapisavaodstavka"/>
-    <w:link w:val="Naslov6"/>
+  <w:style w:type="character" w:customStyle="1" w:styleId="Heading6Char">
+    <w:name w:val="Heading 6 Char"/>
+    <w:basedOn w:val="DefaultParagraphFont"/>
+    <w:link w:val="Heading6"/>
     <w:uiPriority w:val="9"/>
     <w:semiHidden/>
     <w:rsid w:val="00951A8E"/>
@@ -1552,10 +1985,10 @@
       <w:color w:val="595959" w:themeColor="text1" w:themeTint="A6"/>
     </w:rPr>
   </w:style>
-  <w:style w:type="character" w:customStyle="1" w:styleId="Naslov7Znak">
-    <w:name w:val="Naslov 7 Znak"/>
-    <w:basedOn w:val="Privzetapisavaodstavka"/>
-    <w:link w:val="Naslov7"/>
+  <w:style w:type="character" w:customStyle="1" w:styleId="Heading7Char">
+    <w:name w:val="Heading 7 Char"/>
+    <w:basedOn w:val="DefaultParagraphFont"/>
+    <w:link w:val="Heading7"/>
     <w:uiPriority w:val="9"/>
     <w:semiHidden/>
     <w:rsid w:val="00951A8E"/>
@@ -1564,10 +1997,10 @@
       <w:color w:val="595959" w:themeColor="text1" w:themeTint="A6"/>
     </w:rPr>
   </w:style>
-  <w:style w:type="character" w:customStyle="1" w:styleId="Naslov8Znak">
-    <w:name w:val="Naslov 8 Znak"/>
-    <w:basedOn w:val="Privzetapisavaodstavka"/>
-    <w:link w:val="Naslov8"/>
+  <w:style w:type="character" w:customStyle="1" w:styleId="Heading8Char">
+    <w:name w:val="Heading 8 Char"/>
+    <w:basedOn w:val="DefaultParagraphFont"/>
+    <w:link w:val="Heading8"/>
     <w:uiPriority w:val="9"/>
     <w:semiHidden/>
     <w:rsid w:val="00951A8E"/>
@@ -1578,10 +2011,10 @@
       <w:color w:val="272727" w:themeColor="text1" w:themeTint="D8"/>
     </w:rPr>
   </w:style>
-  <w:style w:type="character" w:customStyle="1" w:styleId="Naslov9Znak">
-    <w:name w:val="Naslov 9 Znak"/>
-    <w:basedOn w:val="Privzetapisavaodstavka"/>
-    <w:link w:val="Naslov9"/>
+  <w:style w:type="character" w:customStyle="1" w:styleId="Heading9Char">
+    <w:name w:val="Heading 9 Char"/>
+    <w:basedOn w:val="DefaultParagraphFont"/>
+    <w:link w:val="Heading9"/>
     <w:uiPriority w:val="9"/>
     <w:semiHidden/>
     <w:rsid w:val="00951A8E"/>
@@ -1590,11 +2023,11 @@
       <w:color w:val="272727" w:themeColor="text1" w:themeTint="D8"/>
     </w:rPr>
   </w:style>
-  <w:style w:type="paragraph" w:styleId="Naslov">
+  <w:style w:type="paragraph" w:styleId="Title">
     <w:name w:val="Title"/>
-    <w:basedOn w:val="Navaden"/>
-    <w:next w:val="Navaden"/>
-    <w:link w:val="NaslovZnak"/>
+    <w:basedOn w:val="Normal"/>
+    <w:next w:val="Normal"/>
+    <w:link w:val="TitleChar"/>
     <w:uiPriority w:val="10"/>
     <w:qFormat/>
     <w:rsid w:val="00951A8E"/>
@@ -1612,10 +2045,10 @@
       <w14:ligatures w14:val="standardContextual"/>
     </w:rPr>
   </w:style>
-  <w:style w:type="character" w:customStyle="1" w:styleId="NaslovZnak">
-    <w:name w:val="Naslov Znak"/>
-    <w:basedOn w:val="Privzetapisavaodstavka"/>
-    <w:link w:val="Naslov"/>
+  <w:style w:type="character" w:customStyle="1" w:styleId="TitleChar">
+    <w:name w:val="Title Char"/>
+    <w:basedOn w:val="DefaultParagraphFont"/>
+    <w:link w:val="Title"/>
     <w:uiPriority w:val="10"/>
     <w:rsid w:val="00951A8E"/>
     <w:rPr>
@@ -1626,11 +2059,11 @@
       <w:szCs w:val="56"/>
     </w:rPr>
   </w:style>
-  <w:style w:type="paragraph" w:styleId="Podnaslov">
+  <w:style w:type="paragraph" w:styleId="Subtitle">
     <w:name w:val="Subtitle"/>
-    <w:basedOn w:val="Navaden"/>
-    <w:next w:val="Navaden"/>
-    <w:link w:val="PodnaslovZnak"/>
+    <w:basedOn w:val="Normal"/>
+    <w:next w:val="Normal"/>
+    <w:link w:val="SubtitleChar"/>
     <w:uiPriority w:val="11"/>
     <w:qFormat/>
     <w:rsid w:val="00951A8E"/>
@@ -1651,10 +2084,10 @@
       <w14:ligatures w14:val="standardContextual"/>
     </w:rPr>
   </w:style>
-  <w:style w:type="character" w:customStyle="1" w:styleId="PodnaslovZnak">
-    <w:name w:val="Podnaslov Znak"/>
-    <w:basedOn w:val="Privzetapisavaodstavka"/>
-    <w:link w:val="Podnaslov"/>
+  <w:style w:type="character" w:customStyle="1" w:styleId="SubtitleChar">
+    <w:name w:val="Subtitle Char"/>
+    <w:basedOn w:val="DefaultParagraphFont"/>
+    <w:link w:val="Subtitle"/>
     <w:uiPriority w:val="11"/>
     <w:rsid w:val="00951A8E"/>
     <w:rPr>
@@ -1665,11 +2098,11 @@
       <w:szCs w:val="28"/>
     </w:rPr>
   </w:style>
-  <w:style w:type="paragraph" w:styleId="Citat">
+  <w:style w:type="paragraph" w:styleId="Quote">
     <w:name w:val="Quote"/>
-    <w:basedOn w:val="Navaden"/>
-    <w:next w:val="Navaden"/>
-    <w:link w:val="CitatZnak"/>
+    <w:basedOn w:val="Normal"/>
+    <w:next w:val="Normal"/>
+    <w:link w:val="QuoteChar"/>
     <w:uiPriority w:val="29"/>
     <w:qFormat/>
     <w:rsid w:val="00951A8E"/>
@@ -1686,10 +2119,10 @@
       <w14:ligatures w14:val="standardContextual"/>
     </w:rPr>
   </w:style>
-  <w:style w:type="character" w:customStyle="1" w:styleId="CitatZnak">
-    <w:name w:val="Citat Znak"/>
-    <w:basedOn w:val="Privzetapisavaodstavka"/>
-    <w:link w:val="Citat"/>
+  <w:style w:type="character" w:customStyle="1" w:styleId="QuoteChar">
+    <w:name w:val="Quote Char"/>
+    <w:basedOn w:val="DefaultParagraphFont"/>
+    <w:link w:val="Quote"/>
     <w:uiPriority w:val="29"/>
     <w:rsid w:val="00951A8E"/>
     <w:rPr>
@@ -1698,9 +2131,9 @@
       <w:color w:val="404040" w:themeColor="text1" w:themeTint="BF"/>
     </w:rPr>
   </w:style>
-  <w:style w:type="paragraph" w:styleId="Odstavekseznama">
+  <w:style w:type="paragraph" w:styleId="ListParagraph">
     <w:name w:val="List Paragraph"/>
-    <w:basedOn w:val="Navaden"/>
+    <w:basedOn w:val="Normal"/>
     <w:uiPriority w:val="34"/>
     <w:qFormat/>
     <w:rsid w:val="00951A8E"/>
@@ -1716,9 +2149,9 @@
       <w14:ligatures w14:val="standardContextual"/>
     </w:rPr>
   </w:style>
-  <w:style w:type="character" w:styleId="Intenzivenpoudarek">
+  <w:style w:type="character" w:styleId="IntenseEmphasis">
     <w:name w:val="Intense Emphasis"/>
-    <w:basedOn w:val="Privzetapisavaodstavka"/>
+    <w:basedOn w:val="DefaultParagraphFont"/>
     <w:uiPriority w:val="21"/>
     <w:qFormat/>
     <w:rsid w:val="00951A8E"/>
@@ -1728,11 +2161,11 @@
       <w:color w:val="2F5496" w:themeColor="accent1" w:themeShade="BF"/>
     </w:rPr>
   </w:style>
-  <w:style w:type="paragraph" w:styleId="Intenzivencitat">
+  <w:style w:type="paragraph" w:styleId="IntenseQuote">
     <w:name w:val="Intense Quote"/>
-    <w:basedOn w:val="Navaden"/>
-    <w:next w:val="Navaden"/>
-    <w:link w:val="IntenzivencitatZnak"/>
+    <w:basedOn w:val="Normal"/>
+    <w:next w:val="Normal"/>
+    <w:link w:val="IntenseQuoteChar"/>
     <w:uiPriority w:val="30"/>
     <w:qFormat/>
     <w:rsid w:val="00951A8E"/>
@@ -1754,10 +2187,10 @@
       <w14:ligatures w14:val="standardContextual"/>
     </w:rPr>
   </w:style>
-  <w:style w:type="character" w:customStyle="1" w:styleId="IntenzivencitatZnak">
-    <w:name w:val="Intenziven citat Znak"/>
-    <w:basedOn w:val="Privzetapisavaodstavka"/>
-    <w:link w:val="Intenzivencitat"/>
+  <w:style w:type="character" w:customStyle="1" w:styleId="IntenseQuoteChar">
+    <w:name w:val="Intense Quote Char"/>
+    <w:basedOn w:val="DefaultParagraphFont"/>
+    <w:link w:val="IntenseQuote"/>
     <w:uiPriority w:val="30"/>
     <w:rsid w:val="00951A8E"/>
     <w:rPr>
@@ -1766,9 +2199,9 @@
       <w:color w:val="2F5496" w:themeColor="accent1" w:themeShade="BF"/>
     </w:rPr>
   </w:style>
-  <w:style w:type="character" w:styleId="Intenzivensklic">
+  <w:style w:type="character" w:styleId="IntenseReference">
     <w:name w:val="Intense Reference"/>
-    <w:basedOn w:val="Privzetapisavaodstavka"/>
+    <w:basedOn w:val="DefaultParagraphFont"/>
     <w:uiPriority w:val="32"/>
     <w:qFormat/>
     <w:rsid w:val="00951A8E"/>

</xml_diff>

<commit_message>
9.10.2025 - chapter 3, ARGs
</commit_message>
<xml_diff>
--- a/thesis/discussion.docx
+++ b/thesis/discussion.docx
@@ -4,7 +4,7 @@
   <w:body>
     <w:p>
       <w:pPr>
-        <w:pStyle w:val="Heading1"/>
+        <w:pStyle w:val="Naslov1"/>
         <w:rPr>
           <w:sz w:val="22"/>
         </w:rPr>
@@ -781,27 +781,41 @@
         <w:rPr>
           <w:lang w:val="en-GB"/>
         </w:rPr>
-        <w:t xml:space="preserve"> sporobiota of the gut community is more similar to itself in time than other ethanol-resistant or ethanol non-resistant communities. </w:t>
-      </w:r>
-    </w:p>
-    <w:p>
-      <w:pPr>
-        <w:rPr>
-          <w:lang w:val="en-GB"/>
-        </w:rPr>
-      </w:pPr>
-    </w:p>
-    <w:p>
-      <w:pPr>
-        <w:rPr>
-          <w:rFonts w:cs="Times New Roman"/>
-          <w:lang w:val="en-GB"/>
-        </w:rPr>
-      </w:pPr>
-    </w:p>
-    <w:p>
-      <w:pPr>
-        <w:pStyle w:val="ListParagraph"/>
+        <w:t xml:space="preserve"> sporobiota of the gut community is more </w:t>
+      </w:r>
+      <w:proofErr w:type="gramStart"/>
+      <w:r>
+        <w:rPr>
+          <w:lang w:val="en-GB"/>
+        </w:rPr>
+        <w:t>similar to</w:t>
+      </w:r>
+      <w:proofErr w:type="gramEnd"/>
+      <w:r>
+        <w:rPr>
+          <w:lang w:val="en-GB"/>
+        </w:rPr>
+        <w:t xml:space="preserve"> itself in time than other ethanol-resistant or ethanol non-resistant communities. </w:t>
+      </w:r>
+    </w:p>
+    <w:p>
+      <w:pPr>
+        <w:rPr>
+          <w:lang w:val="en-GB"/>
+        </w:rPr>
+      </w:pPr>
+    </w:p>
+    <w:p>
+      <w:pPr>
+        <w:rPr>
+          <w:rFonts w:cs="Times New Roman"/>
+          <w:lang w:val="en-GB"/>
+        </w:rPr>
+      </w:pPr>
+    </w:p>
+    <w:p>
+      <w:pPr>
+        <w:pStyle w:val="Odstavekseznama"/>
         <w:numPr>
           <w:ilvl w:val="2"/>
           <w:numId w:val="1"/>
@@ -1075,23 +1089,110 @@
           <w:rFonts w:cs="Times New Roman"/>
           <w:lang w:val="en-GB"/>
         </w:rPr>
-        <w:t xml:space="preserve">Although we followed a large </w:t>
-      </w:r>
-      <w:proofErr w:type="gramStart"/>
-      <w:r>
-        <w:rPr>
-          <w:rFonts w:cs="Times New Roman"/>
-          <w:lang w:val="en-GB"/>
-        </w:rPr>
-        <w:t>number</w:t>
-      </w:r>
-      <w:proofErr w:type="gramEnd"/>
-      <w:r>
-        <w:rPr>
-          <w:rFonts w:cs="Times New Roman"/>
-          <w:lang w:val="en-GB"/>
-        </w:rPr>
-        <w:t xml:space="preserve"> of metadata at each time point of sampling, our study is too small (in terms of number of same changes in the whole study) and also changes were to sporadic by individual and between individuals so could not be (with exception of antibiotic consumption) statistically significant linked to changes in the alpha diversity of individuals through time. </w:t>
+        <w:t xml:space="preserve">Although we followed a large number of metadata at each time point of sampling, our study is too small (in terms of number of same changes in the whole study) and also changes were to sporadic by individual and between individuals so could not be (with exception of antibiotic consumption) statistically significant linked to changes in the alpha diversity of individuals through time. </w:t>
+      </w:r>
+    </w:p>
+    <w:p>
+      <w:pPr>
+        <w:rPr>
+          <w:lang w:val="en-GB"/>
+        </w:rPr>
+      </w:pPr>
+      <w:r>
+        <w:rPr>
+          <w:lang w:val="en-GB"/>
+        </w:rPr>
+        <w:t xml:space="preserve">ARGs </w:t>
+      </w:r>
+    </w:p>
+    <w:p>
+      <w:pPr>
+        <w:rPr>
+          <w:rFonts w:cs="Times New Roman"/>
+          <w:lang w:val="en-GB"/>
+        </w:rPr>
+      </w:pPr>
+      <w:r>
+        <w:rPr>
+          <w:rFonts w:cs="Times New Roman"/>
+          <w:lang w:val="en-GB"/>
+        </w:rPr>
+        <w:t xml:space="preserve">We checked for inconsistencies between these two programs, we looked how many genes were found by one program and not the other, if they found the same gene on the same contigs and what were the discrepancies. We filtered results from </w:t>
+      </w:r>
+      <w:proofErr w:type="spellStart"/>
+      <w:r>
+        <w:rPr>
+          <w:rFonts w:cs="Times New Roman"/>
+          <w:lang w:val="en-GB"/>
+        </w:rPr>
+        <w:t>deepARG</w:t>
+      </w:r>
+      <w:proofErr w:type="spellEnd"/>
+      <w:r>
+        <w:rPr>
+          <w:rFonts w:cs="Times New Roman"/>
+          <w:lang w:val="en-GB"/>
+        </w:rPr>
+        <w:t xml:space="preserve"> so that only 90% identity and higher remained. </w:t>
+      </w:r>
+      <w:proofErr w:type="spellStart"/>
+      <w:r>
+        <w:rPr>
+          <w:rFonts w:cs="Times New Roman"/>
+          <w:lang w:val="en-GB"/>
+        </w:rPr>
+        <w:t>d</w:t>
+      </w:r>
+      <w:r>
+        <w:rPr>
+          <w:rFonts w:cs="Times New Roman"/>
+          <w:lang w:val="en-GB"/>
+        </w:rPr>
+        <w:t>eepARG</w:t>
+      </w:r>
+      <w:proofErr w:type="spellEnd"/>
+      <w:r>
+        <w:rPr>
+          <w:rFonts w:cs="Times New Roman"/>
+          <w:lang w:val="en-GB"/>
+        </w:rPr>
+        <w:t xml:space="preserve"> is known to be worse at predicting ARGs with low number of examples in the learning database. </w:t>
+      </w:r>
+    </w:p>
+    <w:p>
+      <w:pPr>
+        <w:rPr>
+          <w:rFonts w:cs="Times New Roman"/>
+          <w:lang w:val="en-GB"/>
+        </w:rPr>
+      </w:pPr>
+      <w:r>
+        <w:rPr>
+          <w:lang w:val="en-GB"/>
+        </w:rPr>
+        <w:t xml:space="preserve">ARG hypothesis testing </w:t>
+      </w:r>
+      <w:r>
+        <w:rPr>
+          <w:rFonts w:cs="Times New Roman"/>
+          <w:lang w:val="en-GB"/>
+        </w:rPr>
+        <w:t xml:space="preserve">Our hypothesis states that when microbial diversity will be reduced, there will be an increase in the presence of antimicrobial resistance genes. Reduced microbial diversity simplifies the ecosystem, removing barriers to the proliferation and genetic exchange of resistant bacteria, while at the same time creating new ecological niches for resistant bacteria left behind to thrive in. </w:t>
+      </w:r>
+    </w:p>
+    <w:p>
+      <w:pPr>
+        <w:rPr>
+          <w:rFonts w:cs="Times New Roman"/>
+          <w:lang w:val="en-GB"/>
+        </w:rPr>
+      </w:pPr>
+      <w:r>
+        <w:rPr>
+          <w:rFonts w:cs="Times New Roman"/>
+          <w:lang w:val="en-GB"/>
+        </w:rPr>
+        <w:t xml:space="preserve">This hypothesis can be tested in different ways as out dataset is longitudinal but also includes multiple individuals (we have a population, although small). </w:t>
       </w:r>
     </w:p>
     <w:p>
@@ -1637,7 +1738,7 @@
     <w:lsdException w:name="Unresolved Mention" w:semiHidden="1" w:unhideWhenUsed="1"/>
     <w:lsdException w:name="Smart Link" w:semiHidden="1" w:unhideWhenUsed="1"/>
   </w:latentStyles>
-  <w:style w:type="paragraph" w:default="1" w:styleId="Normal">
+  <w:style w:type="paragraph" w:default="1" w:styleId="Navaden">
     <w:name w:val="Normal"/>
     <w:qFormat/>
     <w:rsid w:val="00951A8E"/>
@@ -1651,11 +1752,11 @@
       <w14:ligatures w14:val="none"/>
     </w:rPr>
   </w:style>
-  <w:style w:type="paragraph" w:styleId="Heading1">
+  <w:style w:type="paragraph" w:styleId="Naslov1">
     <w:name w:val="heading 1"/>
-    <w:basedOn w:val="Normal"/>
-    <w:next w:val="Normal"/>
-    <w:link w:val="Heading1Char"/>
+    <w:basedOn w:val="Navaden"/>
+    <w:next w:val="Navaden"/>
+    <w:link w:val="Naslov1Znak"/>
     <w:uiPriority w:val="9"/>
     <w:qFormat/>
     <w:rsid w:val="00951A8E"/>
@@ -1675,11 +1776,11 @@
       <w14:ligatures w14:val="standardContextual"/>
     </w:rPr>
   </w:style>
-  <w:style w:type="paragraph" w:styleId="Heading2">
+  <w:style w:type="paragraph" w:styleId="Naslov2">
     <w:name w:val="heading 2"/>
-    <w:basedOn w:val="Normal"/>
-    <w:next w:val="Normal"/>
-    <w:link w:val="Heading2Char"/>
+    <w:basedOn w:val="Navaden"/>
+    <w:next w:val="Navaden"/>
+    <w:link w:val="Naslov2Znak"/>
     <w:uiPriority w:val="9"/>
     <w:semiHidden/>
     <w:unhideWhenUsed/>
@@ -1701,11 +1802,11 @@
       <w14:ligatures w14:val="standardContextual"/>
     </w:rPr>
   </w:style>
-  <w:style w:type="paragraph" w:styleId="Heading3">
+  <w:style w:type="paragraph" w:styleId="Naslov3">
     <w:name w:val="heading 3"/>
-    <w:basedOn w:val="Normal"/>
-    <w:next w:val="Normal"/>
-    <w:link w:val="Heading3Char"/>
+    <w:basedOn w:val="Navaden"/>
+    <w:next w:val="Navaden"/>
+    <w:link w:val="Naslov3Znak"/>
     <w:uiPriority w:val="9"/>
     <w:semiHidden/>
     <w:unhideWhenUsed/>
@@ -1727,11 +1828,11 @@
       <w14:ligatures w14:val="standardContextual"/>
     </w:rPr>
   </w:style>
-  <w:style w:type="paragraph" w:styleId="Heading4">
+  <w:style w:type="paragraph" w:styleId="Naslov4">
     <w:name w:val="heading 4"/>
-    <w:basedOn w:val="Normal"/>
-    <w:next w:val="Normal"/>
-    <w:link w:val="Heading4Char"/>
+    <w:basedOn w:val="Navaden"/>
+    <w:next w:val="Navaden"/>
+    <w:link w:val="Naslov4Znak"/>
     <w:uiPriority w:val="9"/>
     <w:semiHidden/>
     <w:unhideWhenUsed/>
@@ -1753,11 +1854,11 @@
       <w14:ligatures w14:val="standardContextual"/>
     </w:rPr>
   </w:style>
-  <w:style w:type="paragraph" w:styleId="Heading5">
+  <w:style w:type="paragraph" w:styleId="Naslov5">
     <w:name w:val="heading 5"/>
-    <w:basedOn w:val="Normal"/>
-    <w:next w:val="Normal"/>
-    <w:link w:val="Heading5Char"/>
+    <w:basedOn w:val="Navaden"/>
+    <w:next w:val="Navaden"/>
+    <w:link w:val="Naslov5Znak"/>
     <w:uiPriority w:val="9"/>
     <w:semiHidden/>
     <w:unhideWhenUsed/>
@@ -1777,11 +1878,11 @@
       <w14:ligatures w14:val="standardContextual"/>
     </w:rPr>
   </w:style>
-  <w:style w:type="paragraph" w:styleId="Heading6">
+  <w:style w:type="paragraph" w:styleId="Naslov6">
     <w:name w:val="heading 6"/>
-    <w:basedOn w:val="Normal"/>
-    <w:next w:val="Normal"/>
-    <w:link w:val="Heading6Char"/>
+    <w:basedOn w:val="Navaden"/>
+    <w:next w:val="Navaden"/>
+    <w:link w:val="Naslov6Znak"/>
     <w:uiPriority w:val="9"/>
     <w:semiHidden/>
     <w:unhideWhenUsed/>
@@ -1803,11 +1904,11 @@
       <w14:ligatures w14:val="standardContextual"/>
     </w:rPr>
   </w:style>
-  <w:style w:type="paragraph" w:styleId="Heading7">
+  <w:style w:type="paragraph" w:styleId="Naslov7">
     <w:name w:val="heading 7"/>
-    <w:basedOn w:val="Normal"/>
-    <w:next w:val="Normal"/>
-    <w:link w:val="Heading7Char"/>
+    <w:basedOn w:val="Navaden"/>
+    <w:next w:val="Navaden"/>
+    <w:link w:val="Naslov7Znak"/>
     <w:uiPriority w:val="9"/>
     <w:semiHidden/>
     <w:unhideWhenUsed/>
@@ -1827,11 +1928,11 @@
       <w14:ligatures w14:val="standardContextual"/>
     </w:rPr>
   </w:style>
-  <w:style w:type="paragraph" w:styleId="Heading8">
+  <w:style w:type="paragraph" w:styleId="Naslov8">
     <w:name w:val="heading 8"/>
-    <w:basedOn w:val="Normal"/>
-    <w:next w:val="Normal"/>
-    <w:link w:val="Heading8Char"/>
+    <w:basedOn w:val="Navaden"/>
+    <w:next w:val="Navaden"/>
+    <w:link w:val="Naslov8Znak"/>
     <w:uiPriority w:val="9"/>
     <w:semiHidden/>
     <w:unhideWhenUsed/>
@@ -1853,11 +1954,11 @@
       <w14:ligatures w14:val="standardContextual"/>
     </w:rPr>
   </w:style>
-  <w:style w:type="paragraph" w:styleId="Heading9">
+  <w:style w:type="paragraph" w:styleId="Naslov9">
     <w:name w:val="heading 9"/>
-    <w:basedOn w:val="Normal"/>
-    <w:next w:val="Normal"/>
-    <w:link w:val="Heading9Char"/>
+    <w:basedOn w:val="Navaden"/>
+    <w:next w:val="Navaden"/>
+    <w:link w:val="Naslov9Znak"/>
     <w:uiPriority w:val="9"/>
     <w:semiHidden/>
     <w:unhideWhenUsed/>
@@ -1877,13 +1978,13 @@
       <w14:ligatures w14:val="standardContextual"/>
     </w:rPr>
   </w:style>
-  <w:style w:type="character" w:default="1" w:styleId="DefaultParagraphFont">
+  <w:style w:type="character" w:default="1" w:styleId="Privzetapisavaodstavka">
     <w:name w:val="Default Paragraph Font"/>
     <w:uiPriority w:val="1"/>
     <w:semiHidden/>
     <w:unhideWhenUsed/>
   </w:style>
-  <w:style w:type="table" w:default="1" w:styleId="TableNormal">
+  <w:style w:type="table" w:default="1" w:styleId="Navadnatabela">
     <w:name w:val="Normal Table"/>
     <w:uiPriority w:val="99"/>
     <w:semiHidden/>
@@ -1898,16 +1999,16 @@
       </w:tblCellMar>
     </w:tblPr>
   </w:style>
-  <w:style w:type="numbering" w:default="1" w:styleId="NoList">
+  <w:style w:type="numbering" w:default="1" w:styleId="Brezseznama">
     <w:name w:val="No List"/>
     <w:uiPriority w:val="99"/>
     <w:semiHidden/>
     <w:unhideWhenUsed/>
   </w:style>
-  <w:style w:type="character" w:customStyle="1" w:styleId="Heading1Char">
-    <w:name w:val="Heading 1 Char"/>
-    <w:basedOn w:val="DefaultParagraphFont"/>
-    <w:link w:val="Heading1"/>
+  <w:style w:type="character" w:customStyle="1" w:styleId="Naslov1Znak">
+    <w:name w:val="Naslov 1 Znak"/>
+    <w:basedOn w:val="Privzetapisavaodstavka"/>
+    <w:link w:val="Naslov1"/>
     <w:uiPriority w:val="9"/>
     <w:rsid w:val="00951A8E"/>
     <w:rPr>
@@ -1917,10 +2018,10 @@
       <w:szCs w:val="40"/>
     </w:rPr>
   </w:style>
-  <w:style w:type="character" w:customStyle="1" w:styleId="Heading2Char">
-    <w:name w:val="Heading 2 Char"/>
-    <w:basedOn w:val="DefaultParagraphFont"/>
-    <w:link w:val="Heading2"/>
+  <w:style w:type="character" w:customStyle="1" w:styleId="Naslov2Znak">
+    <w:name w:val="Naslov 2 Znak"/>
+    <w:basedOn w:val="Privzetapisavaodstavka"/>
+    <w:link w:val="Naslov2"/>
     <w:uiPriority w:val="9"/>
     <w:semiHidden/>
     <w:rsid w:val="00951A8E"/>
@@ -1931,10 +2032,10 @@
       <w:szCs w:val="32"/>
     </w:rPr>
   </w:style>
-  <w:style w:type="character" w:customStyle="1" w:styleId="Heading3Char">
-    <w:name w:val="Heading 3 Char"/>
-    <w:basedOn w:val="DefaultParagraphFont"/>
-    <w:link w:val="Heading3"/>
+  <w:style w:type="character" w:customStyle="1" w:styleId="Naslov3Znak">
+    <w:name w:val="Naslov 3 Znak"/>
+    <w:basedOn w:val="Privzetapisavaodstavka"/>
+    <w:link w:val="Naslov3"/>
     <w:uiPriority w:val="9"/>
     <w:semiHidden/>
     <w:rsid w:val="00951A8E"/>
@@ -1945,10 +2046,10 @@
       <w:szCs w:val="28"/>
     </w:rPr>
   </w:style>
-  <w:style w:type="character" w:customStyle="1" w:styleId="Heading4Char">
-    <w:name w:val="Heading 4 Char"/>
-    <w:basedOn w:val="DefaultParagraphFont"/>
-    <w:link w:val="Heading4"/>
+  <w:style w:type="character" w:customStyle="1" w:styleId="Naslov4Znak">
+    <w:name w:val="Naslov 4 Znak"/>
+    <w:basedOn w:val="Privzetapisavaodstavka"/>
+    <w:link w:val="Naslov4"/>
     <w:uiPriority w:val="9"/>
     <w:semiHidden/>
     <w:rsid w:val="00951A8E"/>
@@ -1959,10 +2060,10 @@
       <w:color w:val="2F5496" w:themeColor="accent1" w:themeShade="BF"/>
     </w:rPr>
   </w:style>
-  <w:style w:type="character" w:customStyle="1" w:styleId="Heading5Char">
-    <w:name w:val="Heading 5 Char"/>
-    <w:basedOn w:val="DefaultParagraphFont"/>
-    <w:link w:val="Heading5"/>
+  <w:style w:type="character" w:customStyle="1" w:styleId="Naslov5Znak">
+    <w:name w:val="Naslov 5 Znak"/>
+    <w:basedOn w:val="Privzetapisavaodstavka"/>
+    <w:link w:val="Naslov5"/>
     <w:uiPriority w:val="9"/>
     <w:semiHidden/>
     <w:rsid w:val="00951A8E"/>
@@ -1971,10 +2072,10 @@
       <w:color w:val="2F5496" w:themeColor="accent1" w:themeShade="BF"/>
     </w:rPr>
   </w:style>
-  <w:style w:type="character" w:customStyle="1" w:styleId="Heading6Char">
-    <w:name w:val="Heading 6 Char"/>
-    <w:basedOn w:val="DefaultParagraphFont"/>
-    <w:link w:val="Heading6"/>
+  <w:style w:type="character" w:customStyle="1" w:styleId="Naslov6Znak">
+    <w:name w:val="Naslov 6 Znak"/>
+    <w:basedOn w:val="Privzetapisavaodstavka"/>
+    <w:link w:val="Naslov6"/>
     <w:uiPriority w:val="9"/>
     <w:semiHidden/>
     <w:rsid w:val="00951A8E"/>
@@ -1985,10 +2086,10 @@
       <w:color w:val="595959" w:themeColor="text1" w:themeTint="A6"/>
     </w:rPr>
   </w:style>
-  <w:style w:type="character" w:customStyle="1" w:styleId="Heading7Char">
-    <w:name w:val="Heading 7 Char"/>
-    <w:basedOn w:val="DefaultParagraphFont"/>
-    <w:link w:val="Heading7"/>
+  <w:style w:type="character" w:customStyle="1" w:styleId="Naslov7Znak">
+    <w:name w:val="Naslov 7 Znak"/>
+    <w:basedOn w:val="Privzetapisavaodstavka"/>
+    <w:link w:val="Naslov7"/>
     <w:uiPriority w:val="9"/>
     <w:semiHidden/>
     <w:rsid w:val="00951A8E"/>
@@ -1997,10 +2098,10 @@
       <w:color w:val="595959" w:themeColor="text1" w:themeTint="A6"/>
     </w:rPr>
   </w:style>
-  <w:style w:type="character" w:customStyle="1" w:styleId="Heading8Char">
-    <w:name w:val="Heading 8 Char"/>
-    <w:basedOn w:val="DefaultParagraphFont"/>
-    <w:link w:val="Heading8"/>
+  <w:style w:type="character" w:customStyle="1" w:styleId="Naslov8Znak">
+    <w:name w:val="Naslov 8 Znak"/>
+    <w:basedOn w:val="Privzetapisavaodstavka"/>
+    <w:link w:val="Naslov8"/>
     <w:uiPriority w:val="9"/>
     <w:semiHidden/>
     <w:rsid w:val="00951A8E"/>
@@ -2011,10 +2112,10 @@
       <w:color w:val="272727" w:themeColor="text1" w:themeTint="D8"/>
     </w:rPr>
   </w:style>
-  <w:style w:type="character" w:customStyle="1" w:styleId="Heading9Char">
-    <w:name w:val="Heading 9 Char"/>
-    <w:basedOn w:val="DefaultParagraphFont"/>
-    <w:link w:val="Heading9"/>
+  <w:style w:type="character" w:customStyle="1" w:styleId="Naslov9Znak">
+    <w:name w:val="Naslov 9 Znak"/>
+    <w:basedOn w:val="Privzetapisavaodstavka"/>
+    <w:link w:val="Naslov9"/>
     <w:uiPriority w:val="9"/>
     <w:semiHidden/>
     <w:rsid w:val="00951A8E"/>
@@ -2023,11 +2124,11 @@
       <w:color w:val="272727" w:themeColor="text1" w:themeTint="D8"/>
     </w:rPr>
   </w:style>
-  <w:style w:type="paragraph" w:styleId="Title">
+  <w:style w:type="paragraph" w:styleId="Naslov">
     <w:name w:val="Title"/>
-    <w:basedOn w:val="Normal"/>
-    <w:next w:val="Normal"/>
-    <w:link w:val="TitleChar"/>
+    <w:basedOn w:val="Navaden"/>
+    <w:next w:val="Navaden"/>
+    <w:link w:val="NaslovZnak"/>
     <w:uiPriority w:val="10"/>
     <w:qFormat/>
     <w:rsid w:val="00951A8E"/>
@@ -2045,10 +2146,10 @@
       <w14:ligatures w14:val="standardContextual"/>
     </w:rPr>
   </w:style>
-  <w:style w:type="character" w:customStyle="1" w:styleId="TitleChar">
-    <w:name w:val="Title Char"/>
-    <w:basedOn w:val="DefaultParagraphFont"/>
-    <w:link w:val="Title"/>
+  <w:style w:type="character" w:customStyle="1" w:styleId="NaslovZnak">
+    <w:name w:val="Naslov Znak"/>
+    <w:basedOn w:val="Privzetapisavaodstavka"/>
+    <w:link w:val="Naslov"/>
     <w:uiPriority w:val="10"/>
     <w:rsid w:val="00951A8E"/>
     <w:rPr>
@@ -2059,11 +2160,11 @@
       <w:szCs w:val="56"/>
     </w:rPr>
   </w:style>
-  <w:style w:type="paragraph" w:styleId="Subtitle">
+  <w:style w:type="paragraph" w:styleId="Podnaslov">
     <w:name w:val="Subtitle"/>
-    <w:basedOn w:val="Normal"/>
-    <w:next w:val="Normal"/>
-    <w:link w:val="SubtitleChar"/>
+    <w:basedOn w:val="Navaden"/>
+    <w:next w:val="Navaden"/>
+    <w:link w:val="PodnaslovZnak"/>
     <w:uiPriority w:val="11"/>
     <w:qFormat/>
     <w:rsid w:val="00951A8E"/>
@@ -2084,10 +2185,10 @@
       <w14:ligatures w14:val="standardContextual"/>
     </w:rPr>
   </w:style>
-  <w:style w:type="character" w:customStyle="1" w:styleId="SubtitleChar">
-    <w:name w:val="Subtitle Char"/>
-    <w:basedOn w:val="DefaultParagraphFont"/>
-    <w:link w:val="Subtitle"/>
+  <w:style w:type="character" w:customStyle="1" w:styleId="PodnaslovZnak">
+    <w:name w:val="Podnaslov Znak"/>
+    <w:basedOn w:val="Privzetapisavaodstavka"/>
+    <w:link w:val="Podnaslov"/>
     <w:uiPriority w:val="11"/>
     <w:rsid w:val="00951A8E"/>
     <w:rPr>
@@ -2098,11 +2199,11 @@
       <w:szCs w:val="28"/>
     </w:rPr>
   </w:style>
-  <w:style w:type="paragraph" w:styleId="Quote">
+  <w:style w:type="paragraph" w:styleId="Citat">
     <w:name w:val="Quote"/>
-    <w:basedOn w:val="Normal"/>
-    <w:next w:val="Normal"/>
-    <w:link w:val="QuoteChar"/>
+    <w:basedOn w:val="Navaden"/>
+    <w:next w:val="Navaden"/>
+    <w:link w:val="CitatZnak"/>
     <w:uiPriority w:val="29"/>
     <w:qFormat/>
     <w:rsid w:val="00951A8E"/>
@@ -2119,10 +2220,10 @@
       <w14:ligatures w14:val="standardContextual"/>
     </w:rPr>
   </w:style>
-  <w:style w:type="character" w:customStyle="1" w:styleId="QuoteChar">
-    <w:name w:val="Quote Char"/>
-    <w:basedOn w:val="DefaultParagraphFont"/>
-    <w:link w:val="Quote"/>
+  <w:style w:type="character" w:customStyle="1" w:styleId="CitatZnak">
+    <w:name w:val="Citat Znak"/>
+    <w:basedOn w:val="Privzetapisavaodstavka"/>
+    <w:link w:val="Citat"/>
     <w:uiPriority w:val="29"/>
     <w:rsid w:val="00951A8E"/>
     <w:rPr>
@@ -2131,9 +2232,9 @@
       <w:color w:val="404040" w:themeColor="text1" w:themeTint="BF"/>
     </w:rPr>
   </w:style>
-  <w:style w:type="paragraph" w:styleId="ListParagraph">
+  <w:style w:type="paragraph" w:styleId="Odstavekseznama">
     <w:name w:val="List Paragraph"/>
-    <w:basedOn w:val="Normal"/>
+    <w:basedOn w:val="Navaden"/>
     <w:uiPriority w:val="34"/>
     <w:qFormat/>
     <w:rsid w:val="00951A8E"/>
@@ -2149,9 +2250,9 @@
       <w14:ligatures w14:val="standardContextual"/>
     </w:rPr>
   </w:style>
-  <w:style w:type="character" w:styleId="IntenseEmphasis">
+  <w:style w:type="character" w:styleId="Intenzivenpoudarek">
     <w:name w:val="Intense Emphasis"/>
-    <w:basedOn w:val="DefaultParagraphFont"/>
+    <w:basedOn w:val="Privzetapisavaodstavka"/>
     <w:uiPriority w:val="21"/>
     <w:qFormat/>
     <w:rsid w:val="00951A8E"/>
@@ -2161,11 +2262,11 @@
       <w:color w:val="2F5496" w:themeColor="accent1" w:themeShade="BF"/>
     </w:rPr>
   </w:style>
-  <w:style w:type="paragraph" w:styleId="IntenseQuote">
+  <w:style w:type="paragraph" w:styleId="Intenzivencitat">
     <w:name w:val="Intense Quote"/>
-    <w:basedOn w:val="Normal"/>
-    <w:next w:val="Normal"/>
-    <w:link w:val="IntenseQuoteChar"/>
+    <w:basedOn w:val="Navaden"/>
+    <w:next w:val="Navaden"/>
+    <w:link w:val="IntenzivencitatZnak"/>
     <w:uiPriority w:val="30"/>
     <w:qFormat/>
     <w:rsid w:val="00951A8E"/>
@@ -2187,10 +2288,10 @@
       <w14:ligatures w14:val="standardContextual"/>
     </w:rPr>
   </w:style>
-  <w:style w:type="character" w:customStyle="1" w:styleId="IntenseQuoteChar">
-    <w:name w:val="Intense Quote Char"/>
-    <w:basedOn w:val="DefaultParagraphFont"/>
-    <w:link w:val="IntenseQuote"/>
+  <w:style w:type="character" w:customStyle="1" w:styleId="IntenzivencitatZnak">
+    <w:name w:val="Intenziven citat Znak"/>
+    <w:basedOn w:val="Privzetapisavaodstavka"/>
+    <w:link w:val="Intenzivencitat"/>
     <w:uiPriority w:val="30"/>
     <w:rsid w:val="00951A8E"/>
     <w:rPr>
@@ -2199,9 +2300,9 @@
       <w:color w:val="2F5496" w:themeColor="accent1" w:themeShade="BF"/>
     </w:rPr>
   </w:style>
-  <w:style w:type="character" w:styleId="IntenseReference">
+  <w:style w:type="character" w:styleId="Intenzivensklic">
     <w:name w:val="Intense Reference"/>
-    <w:basedOn w:val="DefaultParagraphFont"/>
+    <w:basedOn w:val="Privzetapisavaodstavka"/>
     <w:uiPriority w:val="32"/>
     <w:qFormat/>
     <w:rsid w:val="00951A8E"/>

</xml_diff>

<commit_message>
13.10.2025 - chapter 3 ARGs
</commit_message>
<xml_diff>
--- a/thesis/discussion.docx
+++ b/thesis/discussion.docx
@@ -4,7 +4,7 @@
   <w:body>
     <w:p>
       <w:pPr>
-        <w:pStyle w:val="Naslov1"/>
+        <w:pStyle w:val="Heading1"/>
         <w:rPr>
           <w:sz w:val="22"/>
         </w:rPr>
@@ -781,41 +781,27 @@
         <w:rPr>
           <w:lang w:val="en-GB"/>
         </w:rPr>
-        <w:t xml:space="preserve"> sporobiota of the gut community is more </w:t>
-      </w:r>
-      <w:proofErr w:type="gramStart"/>
-      <w:r>
-        <w:rPr>
-          <w:lang w:val="en-GB"/>
-        </w:rPr>
-        <w:t>similar to</w:t>
-      </w:r>
-      <w:proofErr w:type="gramEnd"/>
-      <w:r>
-        <w:rPr>
-          <w:lang w:val="en-GB"/>
-        </w:rPr>
-        <w:t xml:space="preserve"> itself in time than other ethanol-resistant or ethanol non-resistant communities. </w:t>
-      </w:r>
-    </w:p>
-    <w:p>
-      <w:pPr>
-        <w:rPr>
-          <w:lang w:val="en-GB"/>
-        </w:rPr>
-      </w:pPr>
-    </w:p>
-    <w:p>
-      <w:pPr>
-        <w:rPr>
-          <w:rFonts w:cs="Times New Roman"/>
-          <w:lang w:val="en-GB"/>
-        </w:rPr>
-      </w:pPr>
-    </w:p>
-    <w:p>
-      <w:pPr>
-        <w:pStyle w:val="Odstavekseznama"/>
+        <w:t xml:space="preserve"> sporobiota of the gut community is more similar to itself in time than other ethanol-resistant or ethanol non-resistant communities. </w:t>
+      </w:r>
+    </w:p>
+    <w:p>
+      <w:pPr>
+        <w:rPr>
+          <w:lang w:val="en-GB"/>
+        </w:rPr>
+      </w:pPr>
+    </w:p>
+    <w:p>
+      <w:pPr>
+        <w:rPr>
+          <w:rFonts w:cs="Times New Roman"/>
+          <w:lang w:val="en-GB"/>
+        </w:rPr>
+      </w:pPr>
+    </w:p>
+    <w:p>
+      <w:pPr>
+        <w:pStyle w:val="ListParagraph"/>
         <w:numPr>
           <w:ilvl w:val="2"/>
           <w:numId w:val="1"/>
@@ -1193,6 +1179,110 @@
           <w:lang w:val="en-GB"/>
         </w:rPr>
         <w:t xml:space="preserve">This hypothesis can be tested in different ways as out dataset is longitudinal but also includes multiple individuals (we have a population, although small). </w:t>
+      </w:r>
+    </w:p>
+    <w:p>
+      <w:pPr>
+        <w:rPr>
+          <w:rFonts w:cs="Times New Roman"/>
+          <w:lang w:val="en-GB"/>
+        </w:rPr>
+      </w:pPr>
+      <w:r>
+        <w:rPr>
+          <w:rFonts w:cs="Times New Roman"/>
+          <w:lang w:val="en-GB"/>
+        </w:rPr>
+        <w:t xml:space="preserve">There is no correlation between either richness or Shannon’s diversity index (based on </w:t>
+      </w:r>
+      <w:proofErr w:type="spellStart"/>
+      <w:r>
+        <w:rPr>
+          <w:rFonts w:cs="Times New Roman"/>
+          <w:lang w:val="en-GB"/>
+        </w:rPr>
+        <w:t>SGBs</w:t>
+      </w:r>
+      <w:proofErr w:type="spellEnd"/>
+      <w:r>
+        <w:rPr>
+          <w:rFonts w:cs="Times New Roman"/>
+          <w:lang w:val="en-GB"/>
+        </w:rPr>
+        <w:t xml:space="preserve"> or OTUs) to the number of unique ARGs or to the number of reads mapped (</w:t>
+      </w:r>
+      <w:proofErr w:type="spellStart"/>
+      <w:r>
+        <w:rPr>
+          <w:rFonts w:cs="Times New Roman"/>
+          <w:lang w:val="en-GB"/>
+        </w:rPr>
+        <w:t>TPM</w:t>
+      </w:r>
+      <w:proofErr w:type="spellEnd"/>
+      <w:r>
+        <w:rPr>
+          <w:rFonts w:cs="Times New Roman"/>
+          <w:lang w:val="en-GB"/>
+        </w:rPr>
+        <w:t xml:space="preserve">) to ARGs, this holds true whether we look at all ARGs together or if we separate them by the class of antibiotics towards which they have an effect. The correlations are driven by </w:t>
+      </w:r>
+      <w:proofErr w:type="gramStart"/>
+      <w:r>
+        <w:rPr>
+          <w:rFonts w:cs="Times New Roman"/>
+          <w:lang w:val="en-GB"/>
+        </w:rPr>
+        <w:t>individuals</w:t>
+      </w:r>
+      <w:proofErr w:type="gramEnd"/>
+      <w:r>
+        <w:rPr>
+          <w:rFonts w:cs="Times New Roman"/>
+          <w:lang w:val="en-GB"/>
+        </w:rPr>
+        <w:t xml:space="preserve"> higher diversity which drives higher diversity of ARGs, while within an individual a reduced or increased diversity did not influence the diversity of ARGs (Supplementary Figure 7, 8). </w:t>
+      </w:r>
+    </w:p>
+    <w:p>
+      <w:pPr>
+        <w:rPr>
+          <w:rFonts w:cs="Times New Roman"/>
+          <w:lang w:val="en-GB"/>
+        </w:rPr>
+      </w:pPr>
+    </w:p>
+    <w:p>
+      <w:pPr>
+        <w:rPr>
+          <w:lang w:val="en-GB"/>
+        </w:rPr>
+      </w:pPr>
+      <w:r>
+        <w:rPr>
+          <w:lang w:val="en-GB"/>
+        </w:rPr>
+        <w:t>Stability of ARGs over time</w:t>
+      </w:r>
+    </w:p>
+    <w:p>
+      <w:pPr>
+        <w:rPr>
+          <w:lang w:val="en-GB"/>
+        </w:rPr>
+      </w:pPr>
+      <w:r>
+        <w:rPr>
+          <w:lang w:val="en-GB"/>
+        </w:rPr>
+        <w:t xml:space="preserve">Stability can be understood in many ways (see Chapter: A brain dump on stability). Here we have decided to investigate persistence of ARGs within an individual through time coupled with their occupancy (relative abundance). We are aware of the limitation of sequencing as an imperfect method that does not enable to say for sure that something is truly missing or just so rare that we have missed it with our depth of sequencing. But for the reason being we will say that our sequencing was as good as possible, we will not say that something is gone missing but is under the level of detection. A third of </w:t>
+      </w:r>
+      <w:r>
+        <w:rPr>
+          <w:lang w:val="en-GB"/>
+        </w:rPr>
+        <w:lastRenderedPageBreak/>
+        <w:t xml:space="preserve">ARGs have been detected at all time points (28.6 %). We were unable to detect any loss or gain of a new ARG within an individual, even in individuals that had perturbations (AB or travel). </w:t>
       </w:r>
     </w:p>
     <w:p>
@@ -1738,7 +1828,7 @@
     <w:lsdException w:name="Unresolved Mention" w:semiHidden="1" w:unhideWhenUsed="1"/>
     <w:lsdException w:name="Smart Link" w:semiHidden="1" w:unhideWhenUsed="1"/>
   </w:latentStyles>
-  <w:style w:type="paragraph" w:default="1" w:styleId="Navaden">
+  <w:style w:type="paragraph" w:default="1" w:styleId="Normal">
     <w:name w:val="Normal"/>
     <w:qFormat/>
     <w:rsid w:val="00951A8E"/>
@@ -1752,11 +1842,11 @@
       <w14:ligatures w14:val="none"/>
     </w:rPr>
   </w:style>
-  <w:style w:type="paragraph" w:styleId="Naslov1">
+  <w:style w:type="paragraph" w:styleId="Heading1">
     <w:name w:val="heading 1"/>
-    <w:basedOn w:val="Navaden"/>
-    <w:next w:val="Navaden"/>
-    <w:link w:val="Naslov1Znak"/>
+    <w:basedOn w:val="Normal"/>
+    <w:next w:val="Normal"/>
+    <w:link w:val="Heading1Char"/>
     <w:uiPriority w:val="9"/>
     <w:qFormat/>
     <w:rsid w:val="00951A8E"/>
@@ -1776,11 +1866,11 @@
       <w14:ligatures w14:val="standardContextual"/>
     </w:rPr>
   </w:style>
-  <w:style w:type="paragraph" w:styleId="Naslov2">
+  <w:style w:type="paragraph" w:styleId="Heading2">
     <w:name w:val="heading 2"/>
-    <w:basedOn w:val="Navaden"/>
-    <w:next w:val="Navaden"/>
-    <w:link w:val="Naslov2Znak"/>
+    <w:basedOn w:val="Normal"/>
+    <w:next w:val="Normal"/>
+    <w:link w:val="Heading2Char"/>
     <w:uiPriority w:val="9"/>
     <w:semiHidden/>
     <w:unhideWhenUsed/>
@@ -1802,11 +1892,11 @@
       <w14:ligatures w14:val="standardContextual"/>
     </w:rPr>
   </w:style>
-  <w:style w:type="paragraph" w:styleId="Naslov3">
+  <w:style w:type="paragraph" w:styleId="Heading3">
     <w:name w:val="heading 3"/>
-    <w:basedOn w:val="Navaden"/>
-    <w:next w:val="Navaden"/>
-    <w:link w:val="Naslov3Znak"/>
+    <w:basedOn w:val="Normal"/>
+    <w:next w:val="Normal"/>
+    <w:link w:val="Heading3Char"/>
     <w:uiPriority w:val="9"/>
     <w:semiHidden/>
     <w:unhideWhenUsed/>
@@ -1828,11 +1918,11 @@
       <w14:ligatures w14:val="standardContextual"/>
     </w:rPr>
   </w:style>
-  <w:style w:type="paragraph" w:styleId="Naslov4">
+  <w:style w:type="paragraph" w:styleId="Heading4">
     <w:name w:val="heading 4"/>
-    <w:basedOn w:val="Navaden"/>
-    <w:next w:val="Navaden"/>
-    <w:link w:val="Naslov4Znak"/>
+    <w:basedOn w:val="Normal"/>
+    <w:next w:val="Normal"/>
+    <w:link w:val="Heading4Char"/>
     <w:uiPriority w:val="9"/>
     <w:semiHidden/>
     <w:unhideWhenUsed/>
@@ -1854,11 +1944,11 @@
       <w14:ligatures w14:val="standardContextual"/>
     </w:rPr>
   </w:style>
-  <w:style w:type="paragraph" w:styleId="Naslov5">
+  <w:style w:type="paragraph" w:styleId="Heading5">
     <w:name w:val="heading 5"/>
-    <w:basedOn w:val="Navaden"/>
-    <w:next w:val="Navaden"/>
-    <w:link w:val="Naslov5Znak"/>
+    <w:basedOn w:val="Normal"/>
+    <w:next w:val="Normal"/>
+    <w:link w:val="Heading5Char"/>
     <w:uiPriority w:val="9"/>
     <w:semiHidden/>
     <w:unhideWhenUsed/>
@@ -1878,11 +1968,11 @@
       <w14:ligatures w14:val="standardContextual"/>
     </w:rPr>
   </w:style>
-  <w:style w:type="paragraph" w:styleId="Naslov6">
+  <w:style w:type="paragraph" w:styleId="Heading6">
     <w:name w:val="heading 6"/>
-    <w:basedOn w:val="Navaden"/>
-    <w:next w:val="Navaden"/>
-    <w:link w:val="Naslov6Znak"/>
+    <w:basedOn w:val="Normal"/>
+    <w:next w:val="Normal"/>
+    <w:link w:val="Heading6Char"/>
     <w:uiPriority w:val="9"/>
     <w:semiHidden/>
     <w:unhideWhenUsed/>
@@ -1904,11 +1994,11 @@
       <w14:ligatures w14:val="standardContextual"/>
     </w:rPr>
   </w:style>
-  <w:style w:type="paragraph" w:styleId="Naslov7">
+  <w:style w:type="paragraph" w:styleId="Heading7">
     <w:name w:val="heading 7"/>
-    <w:basedOn w:val="Navaden"/>
-    <w:next w:val="Navaden"/>
-    <w:link w:val="Naslov7Znak"/>
+    <w:basedOn w:val="Normal"/>
+    <w:next w:val="Normal"/>
+    <w:link w:val="Heading7Char"/>
     <w:uiPriority w:val="9"/>
     <w:semiHidden/>
     <w:unhideWhenUsed/>
@@ -1928,11 +2018,11 @@
       <w14:ligatures w14:val="standardContextual"/>
     </w:rPr>
   </w:style>
-  <w:style w:type="paragraph" w:styleId="Naslov8">
+  <w:style w:type="paragraph" w:styleId="Heading8">
     <w:name w:val="heading 8"/>
-    <w:basedOn w:val="Navaden"/>
-    <w:next w:val="Navaden"/>
-    <w:link w:val="Naslov8Znak"/>
+    <w:basedOn w:val="Normal"/>
+    <w:next w:val="Normal"/>
+    <w:link w:val="Heading8Char"/>
     <w:uiPriority w:val="9"/>
     <w:semiHidden/>
     <w:unhideWhenUsed/>
@@ -1954,11 +2044,11 @@
       <w14:ligatures w14:val="standardContextual"/>
     </w:rPr>
   </w:style>
-  <w:style w:type="paragraph" w:styleId="Naslov9">
+  <w:style w:type="paragraph" w:styleId="Heading9">
     <w:name w:val="heading 9"/>
-    <w:basedOn w:val="Navaden"/>
-    <w:next w:val="Navaden"/>
-    <w:link w:val="Naslov9Znak"/>
+    <w:basedOn w:val="Normal"/>
+    <w:next w:val="Normal"/>
+    <w:link w:val="Heading9Char"/>
     <w:uiPriority w:val="9"/>
     <w:semiHidden/>
     <w:unhideWhenUsed/>
@@ -1978,13 +2068,13 @@
       <w14:ligatures w14:val="standardContextual"/>
     </w:rPr>
   </w:style>
-  <w:style w:type="character" w:default="1" w:styleId="Privzetapisavaodstavka">
+  <w:style w:type="character" w:default="1" w:styleId="DefaultParagraphFont">
     <w:name w:val="Default Paragraph Font"/>
     <w:uiPriority w:val="1"/>
     <w:semiHidden/>
     <w:unhideWhenUsed/>
   </w:style>
-  <w:style w:type="table" w:default="1" w:styleId="Navadnatabela">
+  <w:style w:type="table" w:default="1" w:styleId="TableNormal">
     <w:name w:val="Normal Table"/>
     <w:uiPriority w:val="99"/>
     <w:semiHidden/>
@@ -1999,16 +2089,16 @@
       </w:tblCellMar>
     </w:tblPr>
   </w:style>
-  <w:style w:type="numbering" w:default="1" w:styleId="Brezseznama">
+  <w:style w:type="numbering" w:default="1" w:styleId="NoList">
     <w:name w:val="No List"/>
     <w:uiPriority w:val="99"/>
     <w:semiHidden/>
     <w:unhideWhenUsed/>
   </w:style>
-  <w:style w:type="character" w:customStyle="1" w:styleId="Naslov1Znak">
-    <w:name w:val="Naslov 1 Znak"/>
-    <w:basedOn w:val="Privzetapisavaodstavka"/>
-    <w:link w:val="Naslov1"/>
+  <w:style w:type="character" w:customStyle="1" w:styleId="Heading1Char">
+    <w:name w:val="Heading 1 Char"/>
+    <w:basedOn w:val="DefaultParagraphFont"/>
+    <w:link w:val="Heading1"/>
     <w:uiPriority w:val="9"/>
     <w:rsid w:val="00951A8E"/>
     <w:rPr>
@@ -2018,10 +2108,10 @@
       <w:szCs w:val="40"/>
     </w:rPr>
   </w:style>
-  <w:style w:type="character" w:customStyle="1" w:styleId="Naslov2Znak">
-    <w:name w:val="Naslov 2 Znak"/>
-    <w:basedOn w:val="Privzetapisavaodstavka"/>
-    <w:link w:val="Naslov2"/>
+  <w:style w:type="character" w:customStyle="1" w:styleId="Heading2Char">
+    <w:name w:val="Heading 2 Char"/>
+    <w:basedOn w:val="DefaultParagraphFont"/>
+    <w:link w:val="Heading2"/>
     <w:uiPriority w:val="9"/>
     <w:semiHidden/>
     <w:rsid w:val="00951A8E"/>
@@ -2032,10 +2122,10 @@
       <w:szCs w:val="32"/>
     </w:rPr>
   </w:style>
-  <w:style w:type="character" w:customStyle="1" w:styleId="Naslov3Znak">
-    <w:name w:val="Naslov 3 Znak"/>
-    <w:basedOn w:val="Privzetapisavaodstavka"/>
-    <w:link w:val="Naslov3"/>
+  <w:style w:type="character" w:customStyle="1" w:styleId="Heading3Char">
+    <w:name w:val="Heading 3 Char"/>
+    <w:basedOn w:val="DefaultParagraphFont"/>
+    <w:link w:val="Heading3"/>
     <w:uiPriority w:val="9"/>
     <w:semiHidden/>
     <w:rsid w:val="00951A8E"/>
@@ -2046,10 +2136,10 @@
       <w:szCs w:val="28"/>
     </w:rPr>
   </w:style>
-  <w:style w:type="character" w:customStyle="1" w:styleId="Naslov4Znak">
-    <w:name w:val="Naslov 4 Znak"/>
-    <w:basedOn w:val="Privzetapisavaodstavka"/>
-    <w:link w:val="Naslov4"/>
+  <w:style w:type="character" w:customStyle="1" w:styleId="Heading4Char">
+    <w:name w:val="Heading 4 Char"/>
+    <w:basedOn w:val="DefaultParagraphFont"/>
+    <w:link w:val="Heading4"/>
     <w:uiPriority w:val="9"/>
     <w:semiHidden/>
     <w:rsid w:val="00951A8E"/>
@@ -2060,10 +2150,10 @@
       <w:color w:val="2F5496" w:themeColor="accent1" w:themeShade="BF"/>
     </w:rPr>
   </w:style>
-  <w:style w:type="character" w:customStyle="1" w:styleId="Naslov5Znak">
-    <w:name w:val="Naslov 5 Znak"/>
-    <w:basedOn w:val="Privzetapisavaodstavka"/>
-    <w:link w:val="Naslov5"/>
+  <w:style w:type="character" w:customStyle="1" w:styleId="Heading5Char">
+    <w:name w:val="Heading 5 Char"/>
+    <w:basedOn w:val="DefaultParagraphFont"/>
+    <w:link w:val="Heading5"/>
     <w:uiPriority w:val="9"/>
     <w:semiHidden/>
     <w:rsid w:val="00951A8E"/>
@@ -2072,10 +2162,10 @@
       <w:color w:val="2F5496" w:themeColor="accent1" w:themeShade="BF"/>
     </w:rPr>
   </w:style>
-  <w:style w:type="character" w:customStyle="1" w:styleId="Naslov6Znak">
-    <w:name w:val="Naslov 6 Znak"/>
-    <w:basedOn w:val="Privzetapisavaodstavka"/>
-    <w:link w:val="Naslov6"/>
+  <w:style w:type="character" w:customStyle="1" w:styleId="Heading6Char">
+    <w:name w:val="Heading 6 Char"/>
+    <w:basedOn w:val="DefaultParagraphFont"/>
+    <w:link w:val="Heading6"/>
     <w:uiPriority w:val="9"/>
     <w:semiHidden/>
     <w:rsid w:val="00951A8E"/>
@@ -2086,10 +2176,10 @@
       <w:color w:val="595959" w:themeColor="text1" w:themeTint="A6"/>
     </w:rPr>
   </w:style>
-  <w:style w:type="character" w:customStyle="1" w:styleId="Naslov7Znak">
-    <w:name w:val="Naslov 7 Znak"/>
-    <w:basedOn w:val="Privzetapisavaodstavka"/>
-    <w:link w:val="Naslov7"/>
+  <w:style w:type="character" w:customStyle="1" w:styleId="Heading7Char">
+    <w:name w:val="Heading 7 Char"/>
+    <w:basedOn w:val="DefaultParagraphFont"/>
+    <w:link w:val="Heading7"/>
     <w:uiPriority w:val="9"/>
     <w:semiHidden/>
     <w:rsid w:val="00951A8E"/>
@@ -2098,10 +2188,10 @@
       <w:color w:val="595959" w:themeColor="text1" w:themeTint="A6"/>
     </w:rPr>
   </w:style>
-  <w:style w:type="character" w:customStyle="1" w:styleId="Naslov8Znak">
-    <w:name w:val="Naslov 8 Znak"/>
-    <w:basedOn w:val="Privzetapisavaodstavka"/>
-    <w:link w:val="Naslov8"/>
+  <w:style w:type="character" w:customStyle="1" w:styleId="Heading8Char">
+    <w:name w:val="Heading 8 Char"/>
+    <w:basedOn w:val="DefaultParagraphFont"/>
+    <w:link w:val="Heading8"/>
     <w:uiPriority w:val="9"/>
     <w:semiHidden/>
     <w:rsid w:val="00951A8E"/>
@@ -2112,10 +2202,10 @@
       <w:color w:val="272727" w:themeColor="text1" w:themeTint="D8"/>
     </w:rPr>
   </w:style>
-  <w:style w:type="character" w:customStyle="1" w:styleId="Naslov9Znak">
-    <w:name w:val="Naslov 9 Znak"/>
-    <w:basedOn w:val="Privzetapisavaodstavka"/>
-    <w:link w:val="Naslov9"/>
+  <w:style w:type="character" w:customStyle="1" w:styleId="Heading9Char">
+    <w:name w:val="Heading 9 Char"/>
+    <w:basedOn w:val="DefaultParagraphFont"/>
+    <w:link w:val="Heading9"/>
     <w:uiPriority w:val="9"/>
     <w:semiHidden/>
     <w:rsid w:val="00951A8E"/>
@@ -2124,11 +2214,11 @@
       <w:color w:val="272727" w:themeColor="text1" w:themeTint="D8"/>
     </w:rPr>
   </w:style>
-  <w:style w:type="paragraph" w:styleId="Naslov">
+  <w:style w:type="paragraph" w:styleId="Title">
     <w:name w:val="Title"/>
-    <w:basedOn w:val="Navaden"/>
-    <w:next w:val="Navaden"/>
-    <w:link w:val="NaslovZnak"/>
+    <w:basedOn w:val="Normal"/>
+    <w:next w:val="Normal"/>
+    <w:link w:val="TitleChar"/>
     <w:uiPriority w:val="10"/>
     <w:qFormat/>
     <w:rsid w:val="00951A8E"/>
@@ -2146,10 +2236,10 @@
       <w14:ligatures w14:val="standardContextual"/>
     </w:rPr>
   </w:style>
-  <w:style w:type="character" w:customStyle="1" w:styleId="NaslovZnak">
-    <w:name w:val="Naslov Znak"/>
-    <w:basedOn w:val="Privzetapisavaodstavka"/>
-    <w:link w:val="Naslov"/>
+  <w:style w:type="character" w:customStyle="1" w:styleId="TitleChar">
+    <w:name w:val="Title Char"/>
+    <w:basedOn w:val="DefaultParagraphFont"/>
+    <w:link w:val="Title"/>
     <w:uiPriority w:val="10"/>
     <w:rsid w:val="00951A8E"/>
     <w:rPr>
@@ -2160,11 +2250,11 @@
       <w:szCs w:val="56"/>
     </w:rPr>
   </w:style>
-  <w:style w:type="paragraph" w:styleId="Podnaslov">
+  <w:style w:type="paragraph" w:styleId="Subtitle">
     <w:name w:val="Subtitle"/>
-    <w:basedOn w:val="Navaden"/>
-    <w:next w:val="Navaden"/>
-    <w:link w:val="PodnaslovZnak"/>
+    <w:basedOn w:val="Normal"/>
+    <w:next w:val="Normal"/>
+    <w:link w:val="SubtitleChar"/>
     <w:uiPriority w:val="11"/>
     <w:qFormat/>
     <w:rsid w:val="00951A8E"/>
@@ -2185,10 +2275,10 @@
       <w14:ligatures w14:val="standardContextual"/>
     </w:rPr>
   </w:style>
-  <w:style w:type="character" w:customStyle="1" w:styleId="PodnaslovZnak">
-    <w:name w:val="Podnaslov Znak"/>
-    <w:basedOn w:val="Privzetapisavaodstavka"/>
-    <w:link w:val="Podnaslov"/>
+  <w:style w:type="character" w:customStyle="1" w:styleId="SubtitleChar">
+    <w:name w:val="Subtitle Char"/>
+    <w:basedOn w:val="DefaultParagraphFont"/>
+    <w:link w:val="Subtitle"/>
     <w:uiPriority w:val="11"/>
     <w:rsid w:val="00951A8E"/>
     <w:rPr>
@@ -2199,11 +2289,11 @@
       <w:szCs w:val="28"/>
     </w:rPr>
   </w:style>
-  <w:style w:type="paragraph" w:styleId="Citat">
+  <w:style w:type="paragraph" w:styleId="Quote">
     <w:name w:val="Quote"/>
-    <w:basedOn w:val="Navaden"/>
-    <w:next w:val="Navaden"/>
-    <w:link w:val="CitatZnak"/>
+    <w:basedOn w:val="Normal"/>
+    <w:next w:val="Normal"/>
+    <w:link w:val="QuoteChar"/>
     <w:uiPriority w:val="29"/>
     <w:qFormat/>
     <w:rsid w:val="00951A8E"/>
@@ -2220,10 +2310,10 @@
       <w14:ligatures w14:val="standardContextual"/>
     </w:rPr>
   </w:style>
-  <w:style w:type="character" w:customStyle="1" w:styleId="CitatZnak">
-    <w:name w:val="Citat Znak"/>
-    <w:basedOn w:val="Privzetapisavaodstavka"/>
-    <w:link w:val="Citat"/>
+  <w:style w:type="character" w:customStyle="1" w:styleId="QuoteChar">
+    <w:name w:val="Quote Char"/>
+    <w:basedOn w:val="DefaultParagraphFont"/>
+    <w:link w:val="Quote"/>
     <w:uiPriority w:val="29"/>
     <w:rsid w:val="00951A8E"/>
     <w:rPr>
@@ -2232,9 +2322,9 @@
       <w:color w:val="404040" w:themeColor="text1" w:themeTint="BF"/>
     </w:rPr>
   </w:style>
-  <w:style w:type="paragraph" w:styleId="Odstavekseznama">
+  <w:style w:type="paragraph" w:styleId="ListParagraph">
     <w:name w:val="List Paragraph"/>
-    <w:basedOn w:val="Navaden"/>
+    <w:basedOn w:val="Normal"/>
     <w:uiPriority w:val="34"/>
     <w:qFormat/>
     <w:rsid w:val="00951A8E"/>
@@ -2250,9 +2340,9 @@
       <w14:ligatures w14:val="standardContextual"/>
     </w:rPr>
   </w:style>
-  <w:style w:type="character" w:styleId="Intenzivenpoudarek">
+  <w:style w:type="character" w:styleId="IntenseEmphasis">
     <w:name w:val="Intense Emphasis"/>
-    <w:basedOn w:val="Privzetapisavaodstavka"/>
+    <w:basedOn w:val="DefaultParagraphFont"/>
     <w:uiPriority w:val="21"/>
     <w:qFormat/>
     <w:rsid w:val="00951A8E"/>
@@ -2262,11 +2352,11 @@
       <w:color w:val="2F5496" w:themeColor="accent1" w:themeShade="BF"/>
     </w:rPr>
   </w:style>
-  <w:style w:type="paragraph" w:styleId="Intenzivencitat">
+  <w:style w:type="paragraph" w:styleId="IntenseQuote">
     <w:name w:val="Intense Quote"/>
-    <w:basedOn w:val="Navaden"/>
-    <w:next w:val="Navaden"/>
-    <w:link w:val="IntenzivencitatZnak"/>
+    <w:basedOn w:val="Normal"/>
+    <w:next w:val="Normal"/>
+    <w:link w:val="IntenseQuoteChar"/>
     <w:uiPriority w:val="30"/>
     <w:qFormat/>
     <w:rsid w:val="00951A8E"/>
@@ -2288,10 +2378,10 @@
       <w14:ligatures w14:val="standardContextual"/>
     </w:rPr>
   </w:style>
-  <w:style w:type="character" w:customStyle="1" w:styleId="IntenzivencitatZnak">
-    <w:name w:val="Intenziven citat Znak"/>
-    <w:basedOn w:val="Privzetapisavaodstavka"/>
-    <w:link w:val="Intenzivencitat"/>
+  <w:style w:type="character" w:customStyle="1" w:styleId="IntenseQuoteChar">
+    <w:name w:val="Intense Quote Char"/>
+    <w:basedOn w:val="DefaultParagraphFont"/>
+    <w:link w:val="IntenseQuote"/>
     <w:uiPriority w:val="30"/>
     <w:rsid w:val="00951A8E"/>
     <w:rPr>
@@ -2300,9 +2390,9 @@
       <w:color w:val="2F5496" w:themeColor="accent1" w:themeShade="BF"/>
     </w:rPr>
   </w:style>
-  <w:style w:type="character" w:styleId="Intenzivensklic">
+  <w:style w:type="character" w:styleId="IntenseReference">
     <w:name w:val="Intense Reference"/>
-    <w:basedOn w:val="Privzetapisavaodstavka"/>
+    <w:basedOn w:val="DefaultParagraphFont"/>
     <w:uiPriority w:val="32"/>
     <w:qFormat/>
     <w:rsid w:val="00951A8E"/>

</xml_diff>